<commit_message>
Research Mthods Notees added-- need to be formatted
</commit_message>
<xml_diff>
--- a/Research_Methods_Notes/Thinking About Research.docx
+++ b/Research_Methods_Notes/Thinking About Research.docx
@@ -308,23 +308,13 @@
           <w:szCs w:val="22"/>
         </w:rPr>
       </w:pPr>
-      <w:proofErr w:type="gramStart"/>
-      <w:r>
-        <w:rPr>
-          <w:rFonts w:ascii="Calibri" w:hAnsi="Calibri" w:cs="Calibri"/>
-          <w:sz w:val="22"/>
-          <w:szCs w:val="22"/>
-        </w:rPr>
-        <w:t>Hypothesis ;</w:t>
-      </w:r>
-      <w:proofErr w:type="gramEnd"/>
-      <w:r>
-        <w:rPr>
-          <w:rFonts w:ascii="Calibri" w:hAnsi="Calibri" w:cs="Calibri"/>
-          <w:sz w:val="22"/>
-          <w:szCs w:val="22"/>
-        </w:rPr>
-        <w:t xml:space="preserve"> A testable assertion about the relationship between things. </w:t>
+      <w:r>
+        <w:rPr>
+          <w:rFonts w:ascii="Calibri" w:hAnsi="Calibri" w:cs="Calibri"/>
+          <w:sz w:val="22"/>
+          <w:szCs w:val="22"/>
+        </w:rPr>
+        <w:t xml:space="preserve">Hypothesis ; A testable assertion about the relationship between things. </w:t>
       </w:r>
     </w:p>
     <w:p>
@@ -587,17 +577,7 @@
           <w:sz w:val="22"/>
           <w:szCs w:val="22"/>
         </w:rPr>
-        <w:t>Systemati</w:t>
-      </w:r>
-      <w:r>
-        <w:rPr>
-          <w:rFonts w:ascii="Calibri" w:hAnsi="Calibri" w:cs="Calibri"/>
-          <w:b/>
-          <w:bCs/>
-          <w:sz w:val="22"/>
-          <w:szCs w:val="22"/>
-        </w:rPr>
-        <w:t>c</w:t>
+        <w:t>Systematic</w:t>
       </w:r>
     </w:p>
     <w:p>
@@ -705,23 +685,7 @@
           <w:sz w:val="22"/>
           <w:szCs w:val="22"/>
         </w:rPr>
-        <w:t>Domain:</w:t>
-      </w:r>
-      <w:r>
-        <w:rPr>
-          <w:rFonts w:ascii="Calibri" w:hAnsi="Calibri" w:cs="Calibri"/>
-          <w:sz w:val="22"/>
-          <w:szCs w:val="22"/>
-        </w:rPr>
-        <w:t xml:space="preserve"> </w:t>
-      </w:r>
-      <w:r>
-        <w:rPr>
-          <w:rFonts w:ascii="Calibri" w:hAnsi="Calibri" w:cs="Calibri"/>
-          <w:sz w:val="22"/>
-          <w:szCs w:val="22"/>
-        </w:rPr>
-        <w:t>What is the domain? What constitutes subject matter?</w:t>
+        <w:t>Domain: What is the domain? What constitutes subject matter?</w:t>
       </w:r>
     </w:p>
     <w:p>
@@ -783,23 +747,7 @@
           <w:sz w:val="22"/>
           <w:szCs w:val="22"/>
         </w:rPr>
-        <w:t xml:space="preserve">There are many </w:t>
-      </w:r>
-      <w:r>
-        <w:rPr>
-          <w:rFonts w:ascii="Calibri" w:hAnsi="Calibri" w:cs="Calibri"/>
-          <w:sz w:val="22"/>
-          <w:szCs w:val="22"/>
-        </w:rPr>
-        <w:t>different</w:t>
-      </w:r>
-      <w:r>
-        <w:rPr>
-          <w:rFonts w:ascii="Calibri" w:hAnsi="Calibri" w:cs="Calibri"/>
-          <w:sz w:val="22"/>
-          <w:szCs w:val="22"/>
-        </w:rPr>
-        <w:t xml:space="preserve"> ontological positions. Here are three</w:t>
+        <w:t>There are many different ontological positions. Here are three</w:t>
       </w:r>
     </w:p>
     <w:p>
@@ -821,23 +769,7 @@
           <w:sz w:val="22"/>
           <w:szCs w:val="22"/>
         </w:rPr>
-        <w:t xml:space="preserve">Objectivism: Social phenomena has existed for their own sake, </w:t>
-      </w:r>
-      <w:r>
-        <w:rPr>
-          <w:rFonts w:ascii="Calibri" w:hAnsi="Calibri" w:cs="Calibri"/>
-          <w:sz w:val="22"/>
-          <w:szCs w:val="22"/>
-        </w:rPr>
-        <w:t>apart</w:t>
-      </w:r>
-      <w:r>
-        <w:rPr>
-          <w:rFonts w:ascii="Calibri" w:hAnsi="Calibri" w:cs="Calibri"/>
-          <w:sz w:val="22"/>
-          <w:szCs w:val="22"/>
-        </w:rPr>
-        <w:t xml:space="preserve"> from and independent to the social actors.</w:t>
+        <w:t>Objectivism: Social phenomena has existed for their own sake, apart from and independent to the social actors.</w:t>
       </w:r>
     </w:p>
     <w:p>
@@ -859,47 +791,7 @@
           <w:sz w:val="22"/>
           <w:szCs w:val="22"/>
         </w:rPr>
-        <w:t xml:space="preserve">Constructivism: Social phenomena are real in the sense that they are constructed ideas that are </w:t>
-      </w:r>
-      <w:r>
-        <w:rPr>
-          <w:rFonts w:ascii="Calibri" w:hAnsi="Calibri" w:cs="Calibri"/>
-          <w:sz w:val="22"/>
-          <w:szCs w:val="22"/>
-        </w:rPr>
-        <w:t>being</w:t>
-      </w:r>
-      <w:r>
-        <w:rPr>
-          <w:rFonts w:ascii="Calibri" w:hAnsi="Calibri" w:cs="Calibri"/>
-          <w:sz w:val="22"/>
-          <w:szCs w:val="22"/>
-        </w:rPr>
-        <w:t xml:space="preserve"> reviewed and reworked by those involved in them. However, the meanings and the understanding is open to </w:t>
-      </w:r>
-      <w:r>
-        <w:rPr>
-          <w:rFonts w:ascii="Calibri" w:hAnsi="Calibri" w:cs="Calibri"/>
-          <w:sz w:val="22"/>
-          <w:szCs w:val="22"/>
-        </w:rPr>
-        <w:t>study. The</w:t>
-      </w:r>
-      <w:r>
-        <w:rPr>
-          <w:rFonts w:ascii="Calibri" w:hAnsi="Calibri" w:cs="Calibri"/>
-          <w:sz w:val="22"/>
-          <w:szCs w:val="22"/>
-        </w:rPr>
-        <w:t xml:space="preserve"> researcher themselves bring their own meanings to the study</w:t>
-      </w:r>
-      <w:r>
-        <w:rPr>
-          <w:rFonts w:ascii="Calibri" w:hAnsi="Calibri" w:cs="Calibri"/>
-          <w:sz w:val="22"/>
-          <w:szCs w:val="22"/>
-        </w:rPr>
-        <w:t xml:space="preserve">. </w:t>
+        <w:t xml:space="preserve">Constructivism: Social phenomena are real in the sense that they are constructed ideas that are being reviewed and reworked by those involved in them. However, the meanings and the understanding is open to study. The researcher themselves bring their own meanings to the study. </w:t>
       </w:r>
     </w:p>
     <w:p>
@@ -921,23 +813,7 @@
           <w:sz w:val="22"/>
           <w:szCs w:val="22"/>
         </w:rPr>
-        <w:t>Realism</w:t>
-      </w:r>
-      <w:r>
-        <w:rPr>
-          <w:rFonts w:ascii="Calibri" w:hAnsi="Calibri" w:cs="Calibri"/>
-          <w:sz w:val="22"/>
-          <w:szCs w:val="22"/>
-        </w:rPr>
-        <w:t>: Like</w:t>
-      </w:r>
-      <w:r>
-        <w:rPr>
-          <w:rFonts w:ascii="Calibri" w:hAnsi="Calibri" w:cs="Calibri"/>
-          <w:sz w:val="22"/>
-          <w:szCs w:val="22"/>
-        </w:rPr>
-        <w:t xml:space="preserve"> the positivist but argues there is a part of the social reality that cannot be directly observed since its hidden.</w:t>
+        <w:t>Realism: Like the positivist but argues there is a part of the social reality that cannot be directly observed since its hidden.</w:t>
       </w:r>
     </w:p>
     <w:p>
@@ -981,23 +857,7 @@
           <w:sz w:val="22"/>
           <w:szCs w:val="22"/>
         </w:rPr>
-        <w:t xml:space="preserve">Positivism- Stems from the objectivist position. There is a social reality to be studied that is independent from the researcher and the research subjects. This type of research includes </w:t>
-      </w:r>
-      <w:r>
-        <w:rPr>
-          <w:rFonts w:ascii="Calibri" w:hAnsi="Calibri" w:cs="Calibri"/>
-          <w:sz w:val="22"/>
-          <w:szCs w:val="22"/>
-        </w:rPr>
-        <w:t>quantitative</w:t>
-      </w:r>
-      <w:r>
-        <w:rPr>
-          <w:rFonts w:ascii="Calibri" w:hAnsi="Calibri" w:cs="Calibri"/>
-          <w:sz w:val="22"/>
-          <w:szCs w:val="22"/>
-        </w:rPr>
-        <w:t xml:space="preserve"> data to be collected, reality is measured, causal relationships are sought.</w:t>
+        <w:t>Positivism- Stems from the objectivist position. There is a social reality to be studied that is independent from the researcher and the research subjects. This type of research includes quantitative data to be collected, reality is measured, causal relationships are sought.</w:t>
       </w:r>
     </w:p>
     <w:p>
@@ -1019,71 +879,7 @@
           <w:sz w:val="22"/>
           <w:szCs w:val="22"/>
         </w:rPr>
-        <w:t xml:space="preserve">Interpretivism-Connected to the idea of Constructivism. Nature of the social phenomena is studied relative to the subjects. This prioritises </w:t>
-      </w:r>
-      <w:r>
-        <w:rPr>
-          <w:rFonts w:ascii="Calibri" w:hAnsi="Calibri" w:cs="Calibri"/>
-          <w:sz w:val="22"/>
-          <w:szCs w:val="22"/>
-        </w:rPr>
-        <w:t>people’s</w:t>
-      </w:r>
-      <w:r>
-        <w:rPr>
-          <w:rFonts w:ascii="Calibri" w:hAnsi="Calibri" w:cs="Calibri"/>
-          <w:sz w:val="22"/>
-          <w:szCs w:val="22"/>
-        </w:rPr>
-        <w:t xml:space="preserve"> subjective interpretations.</w:t>
-      </w:r>
-      <w:r>
-        <w:rPr>
-          <w:rFonts w:ascii="Calibri" w:hAnsi="Calibri" w:cs="Calibri"/>
-          <w:sz w:val="22"/>
-          <w:szCs w:val="22"/>
-        </w:rPr>
-        <w:t xml:space="preserve"> Knowledge</w:t>
-      </w:r>
-      <w:r>
-        <w:rPr>
-          <w:rFonts w:ascii="Calibri" w:hAnsi="Calibri" w:cs="Calibri"/>
-          <w:sz w:val="22"/>
-          <w:szCs w:val="22"/>
-        </w:rPr>
-        <w:t xml:space="preserve"> of </w:t>
-      </w:r>
-      <w:r>
-        <w:rPr>
-          <w:rFonts w:ascii="Calibri" w:hAnsi="Calibri" w:cs="Calibri"/>
-          <w:sz w:val="22"/>
-          <w:szCs w:val="22"/>
-        </w:rPr>
-        <w:t>meanings</w:t>
-      </w:r>
-      <w:r>
-        <w:rPr>
-          <w:rFonts w:ascii="Calibri" w:hAnsi="Calibri" w:cs="Calibri"/>
-          <w:sz w:val="22"/>
-          <w:szCs w:val="22"/>
-        </w:rPr>
-        <w:t xml:space="preserve"> and understandings and meanings are considered. Enabling of </w:t>
-      </w:r>
-      <w:r>
-        <w:rPr>
-          <w:rFonts w:ascii="Calibri" w:hAnsi="Calibri" w:cs="Calibri"/>
-          <w:sz w:val="22"/>
-          <w:szCs w:val="22"/>
-        </w:rPr>
-        <w:t>different</w:t>
-      </w:r>
-      <w:r>
-        <w:rPr>
-          <w:rFonts w:ascii="Calibri" w:hAnsi="Calibri" w:cs="Calibri"/>
-          <w:sz w:val="22"/>
-          <w:szCs w:val="22"/>
-        </w:rPr>
-        <w:t xml:space="preserve"> perspectives to be explored. Usually qualitatively rich, meanings and understandings to be considered.</w:t>
+        <w:t>Interpretivism-Connected to the idea of Constructivism. Nature of the social phenomena is studied relative to the subjects. This prioritises people’s subjective interpretations. Knowledge of meanings and understandings and meanings are considered. Enabling of different perspectives to be explored. Usually qualitatively rich, meanings and understandings to be considered.</w:t>
       </w:r>
     </w:p>
     <w:p>
@@ -1105,145 +901,8 @@
           <w:sz w:val="22"/>
           <w:szCs w:val="22"/>
         </w:rPr>
-        <w:t xml:space="preserve">Realism-Reality exists outside of the </w:t>
-      </w:r>
-      <w:r>
-        <w:rPr>
-          <w:rFonts w:ascii="Calibri" w:hAnsi="Calibri" w:cs="Calibri"/>
-          <w:sz w:val="22"/>
-          <w:szCs w:val="22"/>
-        </w:rPr>
-        <w:t>researcher,</w:t>
-      </w:r>
-      <w:r>
-        <w:rPr>
-          <w:rFonts w:ascii="Calibri" w:hAnsi="Calibri" w:cs="Calibri"/>
-          <w:sz w:val="22"/>
-          <w:szCs w:val="22"/>
-        </w:rPr>
-        <w:t xml:space="preserve"> and this can be studied objectively </w:t>
-      </w:r>
-      <w:r>
-        <w:rPr>
-          <w:rFonts w:ascii="Calibri" w:hAnsi="Calibri" w:cs="Calibri"/>
-          <w:sz w:val="22"/>
-          <w:szCs w:val="22"/>
-        </w:rPr>
-        <w:t>like</w:t>
-      </w:r>
-      <w:r>
-        <w:rPr>
-          <w:rFonts w:ascii="Calibri" w:hAnsi="Calibri" w:cs="Calibri"/>
-          <w:sz w:val="22"/>
-          <w:szCs w:val="22"/>
-        </w:rPr>
-        <w:t xml:space="preserve"> natural sciences. But the social reality is underpinned by </w:t>
-      </w:r>
-      <w:r>
-        <w:rPr>
-          <w:rFonts w:ascii="Calibri" w:hAnsi="Calibri" w:cs="Calibri"/>
-          <w:sz w:val="22"/>
-          <w:szCs w:val="22"/>
-        </w:rPr>
-        <w:t>invisible</w:t>
-      </w:r>
-      <w:r>
-        <w:rPr>
-          <w:rFonts w:ascii="Calibri" w:hAnsi="Calibri" w:cs="Calibri"/>
-          <w:sz w:val="22"/>
-          <w:szCs w:val="22"/>
-        </w:rPr>
-        <w:t xml:space="preserve"> but powerful structures or mechanisms.</w:t>
-      </w:r>
-      <w:r>
-        <w:rPr>
-          <w:rFonts w:ascii="Calibri" w:hAnsi="Calibri" w:cs="Calibri"/>
-          <w:sz w:val="22"/>
-          <w:szCs w:val="22"/>
-        </w:rPr>
-        <w:t xml:space="preserve"> Therefore, the</w:t>
-      </w:r>
-      <w:r>
-        <w:rPr>
-          <w:rFonts w:ascii="Calibri" w:hAnsi="Calibri" w:cs="Calibri"/>
-          <w:sz w:val="22"/>
-          <w:szCs w:val="22"/>
-        </w:rPr>
-        <w:t xml:space="preserve"> main goal of the realist is to identify the hidden </w:t>
-      </w:r>
-      <w:r>
-        <w:rPr>
-          <w:rFonts w:ascii="Calibri" w:hAnsi="Calibri" w:cs="Calibri"/>
-          <w:sz w:val="22"/>
-          <w:szCs w:val="22"/>
-        </w:rPr>
-        <w:t>mechanisms</w:t>
-      </w:r>
-      <w:r>
-        <w:rPr>
-          <w:rFonts w:ascii="Calibri" w:hAnsi="Calibri" w:cs="Calibri"/>
-          <w:sz w:val="22"/>
-          <w:szCs w:val="22"/>
-        </w:rPr>
-        <w:t xml:space="preserve"> and the </w:t>
-      </w:r>
-      <w:r>
-        <w:rPr>
-          <w:rFonts w:ascii="Calibri" w:hAnsi="Calibri" w:cs="Calibri"/>
-          <w:sz w:val="22"/>
-          <w:szCs w:val="22"/>
-        </w:rPr>
-        <w:t>observable</w:t>
-      </w:r>
-      <w:r>
-        <w:rPr>
-          <w:rFonts w:ascii="Calibri" w:hAnsi="Calibri" w:cs="Calibri"/>
-          <w:sz w:val="22"/>
-          <w:szCs w:val="22"/>
-        </w:rPr>
-        <w:t xml:space="preserve"> effects. </w:t>
-      </w:r>
-      <w:r>
-        <w:rPr>
-          <w:rFonts w:ascii="Calibri" w:hAnsi="Calibri" w:cs="Calibri"/>
-          <w:sz w:val="22"/>
-          <w:szCs w:val="22"/>
-        </w:rPr>
-        <w:t>Could</w:t>
-      </w:r>
-      <w:r>
-        <w:rPr>
-          <w:rFonts w:ascii="Calibri" w:hAnsi="Calibri" w:cs="Calibri"/>
-          <w:sz w:val="22"/>
-          <w:szCs w:val="22"/>
-        </w:rPr>
-        <w:t xml:space="preserve"> collect </w:t>
-      </w:r>
-      <w:r>
-        <w:rPr>
-          <w:rFonts w:ascii="Calibri" w:hAnsi="Calibri" w:cs="Calibri"/>
-          <w:sz w:val="22"/>
-          <w:szCs w:val="22"/>
-        </w:rPr>
-        <w:t>quantitative</w:t>
-      </w:r>
-      <w:r>
-        <w:rPr>
-          <w:rFonts w:ascii="Calibri" w:hAnsi="Calibri" w:cs="Calibri"/>
-          <w:sz w:val="22"/>
-          <w:szCs w:val="22"/>
-        </w:rPr>
-        <w:t xml:space="preserve"> or qualitative data, uncover power relations, and research that leads to action.</w:t>
-      </w:r>
-    </w:p>
-    <w:p>
-      <w:pPr>
-        <w:rPr>
-          <w:rFonts w:ascii="Calibri" w:hAnsi="Calibri" w:cs="Calibri"/>
-          <w:sz w:val="22"/>
-          <w:szCs w:val="22"/>
-        </w:rPr>
-      </w:pPr>
+        <w:t>Realism-Reality exists outside of the researcher, and this can be studied objectively like natural sciences. But the social reality is underpinned by invisible but powerful structures or mechanisms. Therefore, the main goal of the realist is to identify the hidden mechanisms and the observable effects. Could collect quantitative or qualitative data, uncover power relations, and research that leads to action.</w:t>
+      </w:r>
     </w:p>
     <w:p>
       <w:pPr>
@@ -1266,40 +925,7 @@
           <w:szCs w:val="22"/>
           <w:u w:val="single"/>
         </w:rPr>
-        <w:t xml:space="preserve">Step </w:t>
-      </w:r>
-      <w:r>
-        <w:rPr>
-          <w:rFonts w:ascii="Calibri" w:hAnsi="Calibri" w:cs="Calibri"/>
-          <w:b/>
-          <w:bCs/>
-          <w:sz w:val="22"/>
-          <w:szCs w:val="22"/>
-          <w:u w:val="single"/>
-        </w:rPr>
-        <w:t>2</w:t>
-      </w:r>
-      <w:r>
-        <w:rPr>
-          <w:rFonts w:ascii="Calibri" w:hAnsi="Calibri" w:cs="Calibri"/>
-          <w:b/>
-          <w:bCs/>
-          <w:sz w:val="22"/>
-          <w:szCs w:val="22"/>
-          <w:u w:val="single"/>
-        </w:rPr>
-        <w:t xml:space="preserve">: </w:t>
-      </w:r>
-      <w:r>
-        <w:rPr>
-          <w:rFonts w:ascii="Calibri" w:hAnsi="Calibri" w:cs="Calibri"/>
-          <w:b/>
-          <w:bCs/>
-          <w:sz w:val="22"/>
-          <w:szCs w:val="22"/>
-          <w:u w:val="single"/>
-        </w:rPr>
-        <w:t xml:space="preserve">Research Questions </w:t>
+        <w:t xml:space="preserve">Step 2: Research Questions </w:t>
       </w:r>
     </w:p>
     <w:p>
@@ -1459,32 +1085,32 @@
           <w:sz w:val="22"/>
           <w:szCs w:val="22"/>
         </w:rPr>
+        <w:t>Evaluation research:</w:t>
+      </w:r>
+      <w:r>
+        <w:rPr>
+          <w:rFonts w:ascii="Calibri" w:hAnsi="Calibri" w:cs="Calibri"/>
+          <w:sz w:val="22"/>
+          <w:szCs w:val="22"/>
+        </w:rPr>
+        <w:t xml:space="preserve"> Assesses the effectiveness, impact, or value of a program, policy, intervention, or process.</w:t>
+      </w:r>
+    </w:p>
+    <w:p>
+      <w:pPr>
+        <w:rPr>
+          <w:rFonts w:ascii="Calibri" w:hAnsi="Calibri" w:cs="Calibri"/>
+          <w:sz w:val="22"/>
+          <w:szCs w:val="22"/>
+        </w:rPr>
+      </w:pPr>
+      <w:r>
+        <w:rPr>
+          <w:rFonts w:ascii="Calibri" w:hAnsi="Calibri" w:cs="Calibri"/>
+          <w:sz w:val="22"/>
+          <w:szCs w:val="22"/>
+        </w:rPr>
         <w:lastRenderedPageBreak/>
-        <w:t>Evaluation research:</w:t>
-      </w:r>
-      <w:r>
-        <w:rPr>
-          <w:rFonts w:ascii="Calibri" w:hAnsi="Calibri" w:cs="Calibri"/>
-          <w:sz w:val="22"/>
-          <w:szCs w:val="22"/>
-        </w:rPr>
-        <w:t xml:space="preserve"> Assesses the effectiveness, impact, or value of a program, policy, intervention, or process.</w:t>
-      </w:r>
-    </w:p>
-    <w:p>
-      <w:pPr>
-        <w:rPr>
-          <w:rFonts w:ascii="Calibri" w:hAnsi="Calibri" w:cs="Calibri"/>
-          <w:sz w:val="22"/>
-          <w:szCs w:val="22"/>
-        </w:rPr>
-      </w:pPr>
-      <w:r>
-        <w:rPr>
-          <w:rFonts w:ascii="Calibri" w:hAnsi="Calibri" w:cs="Calibri"/>
-          <w:sz w:val="22"/>
-          <w:szCs w:val="22"/>
-        </w:rPr>
         <w:t>Some research questions may combine elements of more than one type.</w:t>
       </w:r>
     </w:p>
@@ -1545,6 +1171,7 @@
       <w:r>
         <w:rPr>
           <w:rFonts w:ascii="Calibri" w:hAnsi="Calibri" w:cs="Calibri"/>
+          <w:noProof/>
           <w:sz w:val="22"/>
           <w:szCs w:val="22"/>
         </w:rPr>
@@ -1661,6 +1288,7 @@
       <w:r>
         <w:rPr>
           <w:rFonts w:ascii="Calibri" w:hAnsi="Calibri" w:cs="Calibri"/>
+          <w:noProof/>
           <w:sz w:val="22"/>
           <w:szCs w:val="22"/>
         </w:rPr>
@@ -1723,6 +1351,7 @@
       <w:r>
         <w:rPr>
           <w:rFonts w:ascii="Calibri" w:hAnsi="Calibri" w:cs="Calibri"/>
+          <w:noProof/>
           <w:sz w:val="22"/>
           <w:szCs w:val="22"/>
         </w:rPr>
@@ -1785,6 +1414,7 @@
       <w:r>
         <w:rPr>
           <w:rFonts w:ascii="Calibri" w:hAnsi="Calibri" w:cs="Calibri"/>
+          <w:noProof/>
           <w:sz w:val="22"/>
           <w:szCs w:val="22"/>
         </w:rPr>
@@ -1844,6 +1474,7 @@
       <w:r>
         <w:rPr>
           <w:rFonts w:ascii="Calibri" w:hAnsi="Calibri" w:cs="Calibri"/>
+          <w:noProof/>
           <w:sz w:val="22"/>
           <w:szCs w:val="22"/>
         </w:rPr>
@@ -2013,6 +1644,60 @@
         <w:tabs>
           <w:tab w:val="left" w:pos="1005"/>
         </w:tabs>
+        <w:jc w:val="center"/>
+        <w:rPr>
+          <w:rFonts w:ascii="Calibri" w:hAnsi="Calibri" w:cs="Calibri"/>
+          <w:b/>
+          <w:bCs/>
+          <w:u w:val="single"/>
+        </w:rPr>
+      </w:pPr>
+      <w:r>
+        <w:rPr>
+          <w:rFonts w:ascii="Calibri" w:hAnsi="Calibri" w:cs="Calibri"/>
+          <w:b/>
+          <w:bCs/>
+          <w:u w:val="single"/>
+        </w:rPr>
+        <w:t>Step 3: Mitigating considerations</w:t>
+      </w:r>
+      <w:r>
+        <w:rPr>
+          <w:rFonts w:ascii="Calibri" w:hAnsi="Calibri" w:cs="Calibri"/>
+          <w:b/>
+          <w:bCs/>
+          <w:u w:val="single"/>
+        </w:rPr>
+        <w:t xml:space="preserve"> (Data and Ethics)</w:t>
+      </w:r>
+    </w:p>
+    <w:p>
+      <w:pPr>
+        <w:tabs>
+          <w:tab w:val="left" w:pos="1005"/>
+        </w:tabs>
+        <w:rPr>
+          <w:rFonts w:ascii="Calibri" w:hAnsi="Calibri" w:cs="Calibri"/>
+          <w:b/>
+          <w:bCs/>
+          <w:u w:val="single"/>
+        </w:rPr>
+      </w:pPr>
+      <w:r>
+        <w:rPr>
+          <w:rFonts w:ascii="Calibri" w:hAnsi="Calibri" w:cs="Calibri"/>
+          <w:b/>
+          <w:bCs/>
+          <w:u w:val="single"/>
+        </w:rPr>
+        <w:t xml:space="preserve">The role of data: </w:t>
+      </w:r>
+    </w:p>
+    <w:p>
+      <w:pPr>
+        <w:tabs>
+          <w:tab w:val="left" w:pos="1005"/>
+        </w:tabs>
         <w:rPr>
           <w:rFonts w:ascii="Calibri" w:hAnsi="Calibri" w:cs="Calibri"/>
         </w:rPr>
@@ -2022,22 +1707,812 @@
           <w:rFonts w:ascii="Calibri" w:hAnsi="Calibri" w:cs="Calibri"/>
         </w:rPr>
         <w:lastRenderedPageBreak/>
-        <w:t xml:space="preserve">Mitigating </w:t>
-      </w:r>
-      <w:proofErr w:type="gramStart"/>
-      <w:r>
-        <w:rPr>
-          <w:rFonts w:ascii="Calibri" w:hAnsi="Calibri" w:cs="Calibri"/>
-        </w:rPr>
-        <w:t>sections( ethical</w:t>
-      </w:r>
-      <w:proofErr w:type="gramEnd"/>
-      <w:r>
-        <w:rPr>
-          <w:rFonts w:ascii="Calibri" w:hAnsi="Calibri" w:cs="Calibri"/>
-        </w:rPr>
-        <w:t xml:space="preserve"> and data to follow)</w:t>
-      </w:r>
+        <w:t xml:space="preserve">We cannot simply know social phenomena. Therefore, data is used as a proxy to infer what happens to social </w:t>
+      </w:r>
+      <w:r>
+        <w:rPr>
+          <w:rFonts w:ascii="Calibri" w:hAnsi="Calibri" w:cs="Calibri"/>
+        </w:rPr>
+        <w:t>phenomena.</w:t>
+      </w:r>
+      <w:r>
+        <w:rPr>
+          <w:rFonts w:ascii="Calibri" w:hAnsi="Calibri" w:cs="Calibri"/>
+        </w:rPr>
+        <w:t xml:space="preserve"> There are a few things to consider with data: </w:t>
+      </w:r>
+    </w:p>
+    <w:p>
+      <w:pPr>
+        <w:pStyle w:val="ListParagraph"/>
+        <w:numPr>
+          <w:ilvl w:val="0"/>
+          <w:numId w:val="11"/>
+        </w:numPr>
+        <w:tabs>
+          <w:tab w:val="left" w:pos="1005"/>
+        </w:tabs>
+        <w:rPr>
+          <w:rFonts w:ascii="Calibri" w:hAnsi="Calibri" w:cs="Calibri"/>
+        </w:rPr>
+      </w:pPr>
+      <w:r>
+        <w:rPr>
+          <w:rFonts w:ascii="Calibri" w:hAnsi="Calibri" w:cs="Calibri"/>
+        </w:rPr>
+        <w:t xml:space="preserve">There are various forms of data: </w:t>
+      </w:r>
+      <w:r>
+        <w:rPr>
+          <w:rFonts w:ascii="Calibri" w:hAnsi="Calibri" w:cs="Calibri"/>
+        </w:rPr>
+        <w:t xml:space="preserve"> </w:t>
+      </w:r>
+    </w:p>
+    <w:p>
+      <w:pPr>
+        <w:pStyle w:val="ListParagraph"/>
+        <w:numPr>
+          <w:ilvl w:val="0"/>
+          <w:numId w:val="10"/>
+        </w:numPr>
+        <w:tabs>
+          <w:tab w:val="left" w:pos="1005"/>
+        </w:tabs>
+        <w:rPr>
+          <w:rFonts w:ascii="Calibri" w:hAnsi="Calibri" w:cs="Calibri"/>
+        </w:rPr>
+      </w:pPr>
+      <w:r>
+        <w:rPr>
+          <w:rFonts w:ascii="Calibri" w:hAnsi="Calibri" w:cs="Calibri"/>
+        </w:rPr>
+        <w:t>Spoken and written te</w:t>
+      </w:r>
+      <w:r>
+        <w:rPr>
+          <w:rFonts w:ascii="Calibri" w:hAnsi="Calibri" w:cs="Calibri"/>
+        </w:rPr>
+        <w:t xml:space="preserve">xt </w:t>
+      </w:r>
+    </w:p>
+    <w:p>
+      <w:pPr>
+        <w:pStyle w:val="ListParagraph"/>
+        <w:numPr>
+          <w:ilvl w:val="0"/>
+          <w:numId w:val="10"/>
+        </w:numPr>
+        <w:tabs>
+          <w:tab w:val="left" w:pos="1005"/>
+        </w:tabs>
+        <w:rPr>
+          <w:rFonts w:ascii="Calibri" w:hAnsi="Calibri" w:cs="Calibri"/>
+        </w:rPr>
+      </w:pPr>
+      <w:r>
+        <w:rPr>
+          <w:rFonts w:ascii="Calibri" w:hAnsi="Calibri" w:cs="Calibri"/>
+        </w:rPr>
+        <w:t xml:space="preserve">Non-verbal communication </w:t>
+      </w:r>
+    </w:p>
+    <w:p>
+      <w:pPr>
+        <w:pStyle w:val="ListParagraph"/>
+        <w:numPr>
+          <w:ilvl w:val="0"/>
+          <w:numId w:val="10"/>
+        </w:numPr>
+        <w:tabs>
+          <w:tab w:val="left" w:pos="1005"/>
+        </w:tabs>
+        <w:rPr>
+          <w:rFonts w:ascii="Calibri" w:hAnsi="Calibri" w:cs="Calibri"/>
+        </w:rPr>
+      </w:pPr>
+      <w:r>
+        <w:rPr>
+          <w:rFonts w:ascii="Calibri" w:hAnsi="Calibri" w:cs="Calibri"/>
+        </w:rPr>
+        <w:t>Factual data</w:t>
+      </w:r>
+      <w:r>
+        <w:rPr>
+          <w:rFonts w:ascii="Calibri" w:hAnsi="Calibri" w:cs="Calibri"/>
+        </w:rPr>
+        <w:t xml:space="preserve">- through observation or through the knowledge of the owner. </w:t>
+      </w:r>
+    </w:p>
+    <w:p>
+      <w:pPr>
+        <w:pStyle w:val="ListParagraph"/>
+        <w:numPr>
+          <w:ilvl w:val="0"/>
+          <w:numId w:val="10"/>
+        </w:numPr>
+        <w:tabs>
+          <w:tab w:val="left" w:pos="1005"/>
+        </w:tabs>
+        <w:rPr>
+          <w:rFonts w:ascii="Calibri" w:hAnsi="Calibri" w:cs="Calibri"/>
+        </w:rPr>
+      </w:pPr>
+      <w:r>
+        <w:rPr>
+          <w:rFonts w:ascii="Calibri" w:hAnsi="Calibri" w:cs="Calibri"/>
+        </w:rPr>
+        <w:t xml:space="preserve">Value statements </w:t>
+      </w:r>
+      <w:r>
+        <w:rPr>
+          <w:rFonts w:ascii="Calibri" w:hAnsi="Calibri" w:cs="Calibri"/>
+        </w:rPr>
+        <w:t>- Indications</w:t>
+      </w:r>
+      <w:r>
+        <w:rPr>
+          <w:rFonts w:ascii="Calibri" w:hAnsi="Calibri" w:cs="Calibri"/>
+        </w:rPr>
+        <w:t xml:space="preserve"> of opinions from their own judgement or criteria. </w:t>
+      </w:r>
+    </w:p>
+    <w:p>
+      <w:pPr>
+        <w:pStyle w:val="ListParagraph"/>
+        <w:numPr>
+          <w:ilvl w:val="0"/>
+          <w:numId w:val="11"/>
+        </w:numPr>
+        <w:tabs>
+          <w:tab w:val="left" w:pos="1005"/>
+        </w:tabs>
+        <w:rPr>
+          <w:rFonts w:ascii="Calibri" w:hAnsi="Calibri" w:cs="Calibri"/>
+        </w:rPr>
+      </w:pPr>
+      <w:r>
+        <w:rPr>
+          <w:rFonts w:ascii="Calibri" w:hAnsi="Calibri" w:cs="Calibri"/>
+        </w:rPr>
+        <w:t xml:space="preserve">One should also think about how the data is </w:t>
+      </w:r>
+      <w:r>
+        <w:rPr>
+          <w:rFonts w:ascii="Calibri" w:hAnsi="Calibri" w:cs="Calibri"/>
+        </w:rPr>
+        <w:t>structured</w:t>
+      </w:r>
+      <w:r>
+        <w:rPr>
+          <w:rFonts w:ascii="Calibri" w:hAnsi="Calibri" w:cs="Calibri"/>
+        </w:rPr>
+        <w:t xml:space="preserve"> (</w:t>
+      </w:r>
+      <w:r>
+        <w:rPr>
+          <w:rFonts w:ascii="Calibri" w:hAnsi="Calibri" w:cs="Calibri"/>
+        </w:rPr>
+        <w:t>Chronologically</w:t>
+      </w:r>
+      <w:r>
+        <w:rPr>
+          <w:rFonts w:ascii="Calibri" w:hAnsi="Calibri" w:cs="Calibri"/>
+        </w:rPr>
+        <w:t xml:space="preserve">, </w:t>
+      </w:r>
+      <w:r>
+        <w:rPr>
+          <w:rFonts w:ascii="Calibri" w:hAnsi="Calibri" w:cs="Calibri"/>
+        </w:rPr>
+        <w:t>focus on specific parts, could start with context setting)</w:t>
+      </w:r>
+    </w:p>
+    <w:p>
+      <w:pPr>
+        <w:pStyle w:val="ListParagraph"/>
+        <w:numPr>
+          <w:ilvl w:val="0"/>
+          <w:numId w:val="11"/>
+        </w:numPr>
+        <w:tabs>
+          <w:tab w:val="left" w:pos="1005"/>
+        </w:tabs>
+        <w:rPr>
+          <w:rFonts w:ascii="Calibri" w:hAnsi="Calibri" w:cs="Calibri"/>
+        </w:rPr>
+      </w:pPr>
+      <w:r>
+        <w:rPr>
+          <w:rFonts w:ascii="Calibri" w:hAnsi="Calibri" w:cs="Calibri"/>
+        </w:rPr>
+        <w:t xml:space="preserve">Data itself constructed by individuals or through entities. Therefore, one needs to think about what the data </w:t>
+      </w:r>
+      <w:r>
+        <w:rPr>
+          <w:rFonts w:ascii="Calibri" w:hAnsi="Calibri" w:cs="Calibri"/>
+          <w:b/>
+          <w:bCs/>
+        </w:rPr>
+        <w:t>contents</w:t>
+      </w:r>
+      <w:r>
+        <w:rPr>
+          <w:rFonts w:ascii="Calibri" w:hAnsi="Calibri" w:cs="Calibri"/>
+        </w:rPr>
+        <w:t xml:space="preserve"> are and then what it </w:t>
+      </w:r>
+      <w:r>
+        <w:rPr>
+          <w:rFonts w:ascii="Calibri" w:hAnsi="Calibri" w:cs="Calibri"/>
+          <w:b/>
+          <w:bCs/>
+        </w:rPr>
+        <w:t>means</w:t>
+      </w:r>
+      <w:r>
+        <w:rPr>
+          <w:rFonts w:ascii="Calibri" w:hAnsi="Calibri" w:cs="Calibri"/>
+          <w:b/>
+          <w:bCs/>
+        </w:rPr>
+        <w:t xml:space="preserve">. </w:t>
+      </w:r>
+    </w:p>
+    <w:p>
+      <w:pPr>
+        <w:pStyle w:val="ListParagraph"/>
+        <w:numPr>
+          <w:ilvl w:val="0"/>
+          <w:numId w:val="11"/>
+        </w:numPr>
+        <w:tabs>
+          <w:tab w:val="left" w:pos="1005"/>
+        </w:tabs>
+        <w:rPr>
+          <w:rFonts w:ascii="Calibri" w:hAnsi="Calibri" w:cs="Calibri"/>
+        </w:rPr>
+      </w:pPr>
+      <w:r>
+        <w:rPr>
+          <w:rFonts w:ascii="Calibri" w:hAnsi="Calibri" w:cs="Calibri"/>
+        </w:rPr>
+        <w:t>Primary data</w:t>
+      </w:r>
+      <w:r>
+        <w:rPr>
+          <w:rFonts w:ascii="Calibri" w:hAnsi="Calibri" w:cs="Calibri"/>
+        </w:rPr>
+        <w:t xml:space="preserve"> c</w:t>
+      </w:r>
+      <w:r>
+        <w:rPr>
+          <w:rFonts w:ascii="Calibri" w:hAnsi="Calibri" w:cs="Calibri"/>
+        </w:rPr>
+        <w:t>reated by the individual)</w:t>
+      </w:r>
+      <w:r>
+        <w:rPr>
+          <w:rFonts w:ascii="Calibri" w:hAnsi="Calibri" w:cs="Calibri"/>
+        </w:rPr>
+        <w:t xml:space="preserve"> </w:t>
+      </w:r>
+      <w:r>
+        <w:rPr>
+          <w:rFonts w:ascii="Calibri" w:hAnsi="Calibri" w:cs="Calibri"/>
+        </w:rPr>
+        <w:t xml:space="preserve">and secondary </w:t>
+      </w:r>
+      <w:r>
+        <w:rPr>
+          <w:rFonts w:ascii="Calibri" w:hAnsi="Calibri" w:cs="Calibri"/>
+        </w:rPr>
+        <w:t>data</w:t>
+      </w:r>
+      <w:r>
+        <w:rPr>
+          <w:rFonts w:ascii="Calibri" w:hAnsi="Calibri" w:cs="Calibri"/>
+        </w:rPr>
+        <w:t xml:space="preserve"> (</w:t>
+      </w:r>
+      <w:r>
+        <w:rPr>
+          <w:rFonts w:ascii="Calibri" w:hAnsi="Calibri" w:cs="Calibri"/>
+        </w:rPr>
+        <w:t>Produced</w:t>
+      </w:r>
+      <w:r>
+        <w:rPr>
+          <w:rFonts w:ascii="Calibri" w:hAnsi="Calibri" w:cs="Calibri"/>
+        </w:rPr>
+        <w:t xml:space="preserve"> by others)</w:t>
+      </w:r>
+      <w:r>
+        <w:rPr>
+          <w:rFonts w:ascii="Calibri" w:hAnsi="Calibri" w:cs="Calibri"/>
+        </w:rPr>
+        <w:t xml:space="preserve"> have different strengths and weaknesses</w:t>
+      </w:r>
+      <w:r>
+        <w:rPr>
+          <w:rFonts w:ascii="Calibri" w:hAnsi="Calibri" w:cs="Calibri"/>
+        </w:rPr>
+        <w:t>.</w:t>
+      </w:r>
+    </w:p>
+    <w:p>
+      <w:pPr>
+        <w:pStyle w:val="ListParagraph"/>
+        <w:numPr>
+          <w:ilvl w:val="0"/>
+          <w:numId w:val="11"/>
+        </w:numPr>
+        <w:tabs>
+          <w:tab w:val="left" w:pos="1005"/>
+        </w:tabs>
+        <w:rPr>
+          <w:rFonts w:ascii="Calibri" w:hAnsi="Calibri" w:cs="Calibri"/>
+        </w:rPr>
+      </w:pPr>
+      <w:r>
+        <w:rPr>
+          <w:rFonts w:ascii="Calibri" w:hAnsi="Calibri" w:cs="Calibri"/>
+        </w:rPr>
+        <w:t xml:space="preserve">Data and approaches: </w:t>
+      </w:r>
+    </w:p>
+    <w:p>
+      <w:pPr>
+        <w:tabs>
+          <w:tab w:val="left" w:pos="1005"/>
+        </w:tabs>
+        <w:rPr>
+          <w:rFonts w:ascii="Calibri" w:hAnsi="Calibri" w:cs="Calibri"/>
+        </w:rPr>
+      </w:pPr>
+      <w:r>
+        <w:rPr>
+          <w:rFonts w:ascii="Calibri" w:hAnsi="Calibri" w:cs="Calibri"/>
+        </w:rPr>
+        <w:t>Positivist -----</w:t>
+      </w:r>
+      <w:r>
+        <w:rPr>
+          <w:rFonts w:ascii="Calibri" w:hAnsi="Calibri" w:cs="Calibri"/>
+        </w:rPr>
+        <w:t>&gt;</w:t>
+      </w:r>
+      <w:r>
+        <w:rPr>
+          <w:rFonts w:ascii="Calibri" w:hAnsi="Calibri" w:cs="Calibri"/>
+        </w:rPr>
+        <w:t>Factual and Value ------</w:t>
+      </w:r>
+      <w:r>
+        <w:rPr>
+          <w:rFonts w:ascii="Calibri" w:hAnsi="Calibri" w:cs="Calibri"/>
+        </w:rPr>
+        <w:t>&gt;</w:t>
+      </w:r>
+      <w:r>
+        <w:rPr>
+          <w:rFonts w:ascii="Calibri" w:hAnsi="Calibri" w:cs="Calibri"/>
+        </w:rPr>
+        <w:t xml:space="preserve"> Quantitative Methods</w:t>
+      </w:r>
+      <w:r>
+        <w:rPr>
+          <w:rFonts w:ascii="Calibri" w:hAnsi="Calibri" w:cs="Calibri"/>
+        </w:rPr>
+        <w:t xml:space="preserve"> </w:t>
+      </w:r>
+      <w:r>
+        <w:rPr>
+          <w:rFonts w:ascii="Calibri" w:hAnsi="Calibri" w:cs="Calibri"/>
+        </w:rPr>
+        <w:t xml:space="preserve"> </w:t>
+      </w:r>
+    </w:p>
+    <w:p>
+      <w:pPr>
+        <w:tabs>
+          <w:tab w:val="left" w:pos="1005"/>
+        </w:tabs>
+        <w:rPr>
+          <w:rFonts w:ascii="Calibri" w:hAnsi="Calibri" w:cs="Calibri"/>
+        </w:rPr>
+      </w:pPr>
+      <w:r>
+        <w:rPr>
+          <w:rFonts w:ascii="Calibri" w:hAnsi="Calibri" w:cs="Calibri"/>
+        </w:rPr>
+        <w:t xml:space="preserve">Interpretivist </w:t>
+      </w:r>
+      <w:r>
+        <w:rPr>
+          <w:rFonts w:ascii="Calibri" w:hAnsi="Calibri" w:cs="Calibri"/>
+        </w:rPr>
+        <w:t>-----&gt;</w:t>
+      </w:r>
+      <w:r>
+        <w:rPr>
+          <w:rFonts w:ascii="Calibri" w:hAnsi="Calibri" w:cs="Calibri"/>
+        </w:rPr>
+        <w:t>Language +</w:t>
+      </w:r>
+      <w:r>
+        <w:rPr>
+          <w:rFonts w:ascii="Calibri" w:hAnsi="Calibri" w:cs="Calibri"/>
+        </w:rPr>
+        <w:t xml:space="preserve"> </w:t>
+      </w:r>
+      <w:r>
+        <w:rPr>
+          <w:rFonts w:ascii="Calibri" w:hAnsi="Calibri" w:cs="Calibri"/>
+        </w:rPr>
+        <w:t>Spoken, Written &amp; Nonverbal</w:t>
+      </w:r>
+      <w:r>
+        <w:rPr>
+          <w:rFonts w:ascii="Calibri" w:hAnsi="Calibri" w:cs="Calibri"/>
+        </w:rPr>
+        <w:t>------&gt; Qua</w:t>
+      </w:r>
+      <w:r>
+        <w:rPr>
+          <w:rFonts w:ascii="Calibri" w:hAnsi="Calibri" w:cs="Calibri"/>
+        </w:rPr>
+        <w:t>li</w:t>
+      </w:r>
+      <w:r>
+        <w:rPr>
+          <w:rFonts w:ascii="Calibri" w:hAnsi="Calibri" w:cs="Calibri"/>
+        </w:rPr>
+        <w:t xml:space="preserve">tative Methods  </w:t>
+      </w:r>
+    </w:p>
+    <w:p>
+      <w:pPr>
+        <w:tabs>
+          <w:tab w:val="left" w:pos="1005"/>
+        </w:tabs>
+        <w:rPr>
+          <w:rFonts w:ascii="Calibri" w:hAnsi="Calibri" w:cs="Calibri"/>
+        </w:rPr>
+      </w:pPr>
+      <w:r>
+        <w:rPr>
+          <w:rFonts w:ascii="Calibri" w:hAnsi="Calibri" w:cs="Calibri"/>
+        </w:rPr>
+        <w:t xml:space="preserve"> </w:t>
+      </w:r>
+      <w:r>
+        <w:rPr>
+          <w:rFonts w:ascii="Calibri" w:hAnsi="Calibri" w:cs="Calibri"/>
+        </w:rPr>
+        <w:tab/>
+      </w:r>
+      <w:r>
+        <w:rPr>
+          <w:rFonts w:ascii="Calibri" w:hAnsi="Calibri" w:cs="Calibri"/>
+        </w:rPr>
+        <w:t>*</w:t>
+      </w:r>
+      <w:r>
+        <w:rPr>
+          <w:rFonts w:ascii="Calibri" w:hAnsi="Calibri" w:cs="Calibri"/>
+        </w:rPr>
+        <w:t>Increasingly there</w:t>
+      </w:r>
+      <w:r>
+        <w:rPr>
+          <w:rFonts w:ascii="Calibri" w:hAnsi="Calibri" w:cs="Calibri"/>
+        </w:rPr>
+        <w:t xml:space="preserve"> is </w:t>
+      </w:r>
+      <w:r>
+        <w:rPr>
+          <w:rFonts w:ascii="Calibri" w:hAnsi="Calibri" w:cs="Calibri"/>
+        </w:rPr>
+        <w:t xml:space="preserve">the adoption of mixed methods approaches. </w:t>
+      </w:r>
+    </w:p>
+    <w:p>
+      <w:pPr>
+        <w:tabs>
+          <w:tab w:val="left" w:pos="1005"/>
+        </w:tabs>
+        <w:rPr>
+          <w:rFonts w:ascii="Calibri" w:hAnsi="Calibri" w:cs="Calibri"/>
+        </w:rPr>
+      </w:pPr>
+    </w:p>
+    <w:p>
+      <w:pPr>
+        <w:tabs>
+          <w:tab w:val="left" w:pos="1005"/>
+        </w:tabs>
+        <w:rPr>
+          <w:rFonts w:ascii="Calibri" w:hAnsi="Calibri" w:cs="Calibri"/>
+          <w:b/>
+          <w:bCs/>
+          <w:u w:val="single"/>
+        </w:rPr>
+      </w:pPr>
+      <w:r>
+        <w:rPr>
+          <w:rFonts w:ascii="Calibri" w:hAnsi="Calibri" w:cs="Calibri"/>
+          <w:b/>
+          <w:bCs/>
+          <w:u w:val="single"/>
+        </w:rPr>
+        <w:t xml:space="preserve">The role </w:t>
+      </w:r>
+      <w:r>
+        <w:rPr>
+          <w:rFonts w:ascii="Calibri" w:hAnsi="Calibri" w:cs="Calibri"/>
+          <w:b/>
+          <w:bCs/>
+          <w:u w:val="single"/>
+        </w:rPr>
+        <w:t>of Ethics</w:t>
+      </w:r>
+      <w:r>
+        <w:rPr>
+          <w:rFonts w:ascii="Calibri" w:hAnsi="Calibri" w:cs="Calibri"/>
+          <w:b/>
+          <w:bCs/>
+          <w:u w:val="single"/>
+        </w:rPr>
+        <w:t>:</w:t>
+      </w:r>
+    </w:p>
+    <w:p>
+      <w:pPr>
+        <w:tabs>
+          <w:tab w:val="left" w:pos="1005"/>
+        </w:tabs>
+        <w:rPr>
+          <w:rFonts w:ascii="Calibri" w:hAnsi="Calibri" w:cs="Calibri"/>
+        </w:rPr>
+      </w:pPr>
+      <w:r>
+        <w:rPr>
+          <w:rFonts w:ascii="Calibri" w:hAnsi="Calibri" w:cs="Calibri"/>
+        </w:rPr>
+        <w:t xml:space="preserve">Ethics: </w:t>
+      </w:r>
+      <w:r>
+        <w:rPr>
+          <w:rFonts w:ascii="Calibri" w:hAnsi="Calibri" w:cs="Calibri"/>
+        </w:rPr>
+        <w:t>Social and</w:t>
+      </w:r>
+      <w:r>
+        <w:rPr>
+          <w:rFonts w:ascii="Calibri" w:hAnsi="Calibri" w:cs="Calibri"/>
+        </w:rPr>
+        <w:t xml:space="preserve"> moral values involved in undertaking social research. </w:t>
+      </w:r>
+    </w:p>
+    <w:p>
+      <w:pPr>
+        <w:tabs>
+          <w:tab w:val="left" w:pos="1005"/>
+        </w:tabs>
+        <w:rPr>
+          <w:rFonts w:ascii="Calibri" w:hAnsi="Calibri" w:cs="Calibri"/>
+        </w:rPr>
+      </w:pPr>
+      <w:r>
+        <w:rPr>
+          <w:rFonts w:ascii="Calibri" w:hAnsi="Calibri" w:cs="Calibri"/>
+        </w:rPr>
+        <w:t xml:space="preserve">Things to consider: </w:t>
+      </w:r>
+    </w:p>
+    <w:p>
+      <w:pPr>
+        <w:pStyle w:val="ListParagraph"/>
+        <w:numPr>
+          <w:ilvl w:val="0"/>
+          <w:numId w:val="10"/>
+        </w:numPr>
+        <w:tabs>
+          <w:tab w:val="left" w:pos="1005"/>
+        </w:tabs>
+        <w:rPr>
+          <w:rFonts w:ascii="Calibri" w:hAnsi="Calibri" w:cs="Calibri"/>
+        </w:rPr>
+      </w:pPr>
+      <w:r>
+        <w:rPr>
+          <w:rFonts w:ascii="Calibri" w:hAnsi="Calibri" w:cs="Calibri"/>
+        </w:rPr>
+        <w:t>Ethics approvals?</w:t>
+      </w:r>
+    </w:p>
+    <w:p>
+      <w:pPr>
+        <w:pStyle w:val="ListParagraph"/>
+        <w:numPr>
+          <w:ilvl w:val="0"/>
+          <w:numId w:val="10"/>
+        </w:numPr>
+        <w:tabs>
+          <w:tab w:val="left" w:pos="1005"/>
+        </w:tabs>
+        <w:rPr>
+          <w:rFonts w:ascii="Calibri" w:hAnsi="Calibri" w:cs="Calibri"/>
+        </w:rPr>
+      </w:pPr>
+      <w:r>
+        <w:rPr>
+          <w:rFonts w:ascii="Calibri" w:hAnsi="Calibri" w:cs="Calibri"/>
+        </w:rPr>
+        <w:t>Informed Consent</w:t>
+      </w:r>
+    </w:p>
+    <w:p>
+      <w:pPr>
+        <w:pStyle w:val="ListParagraph"/>
+        <w:numPr>
+          <w:ilvl w:val="1"/>
+          <w:numId w:val="10"/>
+        </w:numPr>
+        <w:tabs>
+          <w:tab w:val="left" w:pos="1005"/>
+        </w:tabs>
+        <w:rPr>
+          <w:rFonts w:ascii="Calibri" w:hAnsi="Calibri" w:cs="Calibri"/>
+        </w:rPr>
+      </w:pPr>
+      <w:r>
+        <w:rPr>
+          <w:rFonts w:ascii="Calibri" w:hAnsi="Calibri" w:cs="Calibri"/>
+        </w:rPr>
+        <w:t xml:space="preserve">Consent should be freely given, information, risks, </w:t>
+      </w:r>
+      <w:r>
+        <w:rPr>
+          <w:rFonts w:ascii="Calibri" w:hAnsi="Calibri" w:cs="Calibri"/>
+        </w:rPr>
+        <w:t xml:space="preserve">Informed consent. </w:t>
+      </w:r>
+    </w:p>
+    <w:p>
+      <w:pPr>
+        <w:pStyle w:val="ListParagraph"/>
+        <w:numPr>
+          <w:ilvl w:val="0"/>
+          <w:numId w:val="10"/>
+        </w:numPr>
+        <w:tabs>
+          <w:tab w:val="left" w:pos="1005"/>
+        </w:tabs>
+        <w:rPr>
+          <w:rFonts w:ascii="Calibri" w:hAnsi="Calibri" w:cs="Calibri"/>
+        </w:rPr>
+      </w:pPr>
+      <w:r>
+        <w:rPr>
+          <w:rFonts w:ascii="Calibri" w:hAnsi="Calibri" w:cs="Calibri"/>
+        </w:rPr>
+        <w:t>Power relationshi</w:t>
+      </w:r>
+      <w:r>
+        <w:rPr>
+          <w:rFonts w:ascii="Calibri" w:hAnsi="Calibri" w:cs="Calibri"/>
+        </w:rPr>
+        <w:t xml:space="preserve">ps </w:t>
+      </w:r>
+    </w:p>
+    <w:p>
+      <w:pPr>
+        <w:pStyle w:val="ListParagraph"/>
+        <w:numPr>
+          <w:ilvl w:val="0"/>
+          <w:numId w:val="10"/>
+        </w:numPr>
+        <w:tabs>
+          <w:tab w:val="left" w:pos="1005"/>
+        </w:tabs>
+        <w:rPr>
+          <w:rFonts w:ascii="Calibri" w:hAnsi="Calibri" w:cs="Calibri"/>
+        </w:rPr>
+      </w:pPr>
+      <w:r>
+        <w:rPr>
+          <w:rFonts w:ascii="Calibri" w:hAnsi="Calibri" w:cs="Calibri"/>
+        </w:rPr>
+        <w:t xml:space="preserve">Protection from harm </w:t>
+      </w:r>
+    </w:p>
+    <w:p>
+      <w:pPr>
+        <w:pStyle w:val="ListParagraph"/>
+        <w:numPr>
+          <w:ilvl w:val="1"/>
+          <w:numId w:val="10"/>
+        </w:numPr>
+        <w:tabs>
+          <w:tab w:val="left" w:pos="1005"/>
+        </w:tabs>
+        <w:rPr>
+          <w:rFonts w:ascii="Calibri" w:hAnsi="Calibri" w:cs="Calibri"/>
+        </w:rPr>
+      </w:pPr>
+      <w:r>
+        <w:rPr>
+          <w:rFonts w:ascii="Calibri" w:hAnsi="Calibri" w:cs="Calibri"/>
+        </w:rPr>
+        <w:t>Physical, psychological, Other consequence</w:t>
+      </w:r>
+      <w:r>
+        <w:rPr>
+          <w:rFonts w:ascii="Calibri" w:hAnsi="Calibri" w:cs="Calibri"/>
+        </w:rPr>
+        <w:t>s, Risk, confidentiality, Honesty, anonymity</w:t>
+      </w:r>
+      <w:r>
+        <w:rPr>
+          <w:rFonts w:ascii="Calibri" w:hAnsi="Calibri" w:cs="Calibri"/>
+        </w:rPr>
+        <w:t>, Data Protection. Cultural considerations.</w:t>
+      </w:r>
+    </w:p>
+    <w:p>
+      <w:pPr>
+        <w:pStyle w:val="ListParagraph"/>
+        <w:numPr>
+          <w:ilvl w:val="0"/>
+          <w:numId w:val="10"/>
+        </w:numPr>
+        <w:tabs>
+          <w:tab w:val="left" w:pos="1005"/>
+        </w:tabs>
+        <w:rPr>
+          <w:rFonts w:ascii="Calibri" w:hAnsi="Calibri" w:cs="Calibri"/>
+        </w:rPr>
+      </w:pPr>
+      <w:r>
+        <w:rPr>
+          <w:rFonts w:ascii="Calibri" w:hAnsi="Calibri" w:cs="Calibri"/>
+        </w:rPr>
+        <w:t>Key is for protection from harm?</w:t>
+      </w:r>
+      <w:r>
+        <w:rPr>
+          <w:rFonts w:ascii="Calibri" w:hAnsi="Calibri" w:cs="Calibri"/>
+        </w:rPr>
+        <w:t xml:space="preserve"> </w:t>
+      </w:r>
+      <w:r>
+        <w:rPr>
+          <w:rFonts w:ascii="Calibri" w:hAnsi="Calibri" w:cs="Calibri"/>
+        </w:rPr>
+        <w:t xml:space="preserve"> </w:t>
+      </w:r>
+    </w:p>
+    <w:p>
+      <w:pPr>
+        <w:tabs>
+          <w:tab w:val="left" w:pos="1005"/>
+        </w:tabs>
+        <w:rPr>
+          <w:rFonts w:ascii="Calibri" w:hAnsi="Calibri" w:cs="Calibri"/>
+        </w:rPr>
+      </w:pPr>
+    </w:p>
+    <w:p>
+      <w:pPr>
+        <w:tabs>
+          <w:tab w:val="left" w:pos="1005"/>
+        </w:tabs>
+        <w:rPr>
+          <w:rFonts w:ascii="Calibri" w:hAnsi="Calibri" w:cs="Calibri"/>
+        </w:rPr>
+      </w:pPr>
     </w:p>
     <w:sectPr>
       <w:pgSz w:w="11906" w:h="16838"/>
@@ -2141,6 +2616,118 @@
     </w:lvl>
   </w:abstractNum>
   <w:abstractNum w:abstractNumId="1" w15:restartNumberingAfterBreak="0">
+    <w:nsid w:val="3F3C1187"/>
+    <w:multiLevelType w:val="hybridMultilevel"/>
+    <w:tmpl w:val="4C9439CC"/>
+    <w:lvl w:ilvl="0" w:tplc="B8982896">
+      <w:numFmt w:val="bullet"/>
+      <w:lvlText w:val="-"/>
+      <w:lvlJc w:val="left"/>
+      <w:pPr>
+        <w:ind w:left="1080" w:hanging="360"/>
+      </w:pPr>
+      <w:rPr>
+        <w:rFonts w:ascii="Calibri" w:eastAsiaTheme="minorHAnsi" w:hAnsi="Calibri" w:cs="Calibri" w:hint="default"/>
+      </w:rPr>
+    </w:lvl>
+    <w:lvl w:ilvl="1" w:tplc="08090003">
+      <w:start w:val="1"/>
+      <w:numFmt w:val="bullet"/>
+      <w:lvlText w:val="o"/>
+      <w:lvlJc w:val="left"/>
+      <w:pPr>
+        <w:ind w:left="1800" w:hanging="360"/>
+      </w:pPr>
+      <w:rPr>
+        <w:rFonts w:ascii="Courier New" w:hAnsi="Courier New" w:cs="Courier New" w:hint="default"/>
+      </w:rPr>
+    </w:lvl>
+    <w:lvl w:ilvl="2" w:tplc="08090005" w:tentative="1">
+      <w:start w:val="1"/>
+      <w:numFmt w:val="bullet"/>
+      <w:lvlText w:val=""/>
+      <w:lvlJc w:val="left"/>
+      <w:pPr>
+        <w:ind w:left="2520" w:hanging="360"/>
+      </w:pPr>
+      <w:rPr>
+        <w:rFonts w:ascii="Wingdings" w:hAnsi="Wingdings" w:hint="default"/>
+      </w:rPr>
+    </w:lvl>
+    <w:lvl w:ilvl="3" w:tplc="08090001" w:tentative="1">
+      <w:start w:val="1"/>
+      <w:numFmt w:val="bullet"/>
+      <w:lvlText w:val=""/>
+      <w:lvlJc w:val="left"/>
+      <w:pPr>
+        <w:ind w:left="3240" w:hanging="360"/>
+      </w:pPr>
+      <w:rPr>
+        <w:rFonts w:ascii="Symbol" w:hAnsi="Symbol" w:hint="default"/>
+      </w:rPr>
+    </w:lvl>
+    <w:lvl w:ilvl="4" w:tplc="08090003" w:tentative="1">
+      <w:start w:val="1"/>
+      <w:numFmt w:val="bullet"/>
+      <w:lvlText w:val="o"/>
+      <w:lvlJc w:val="left"/>
+      <w:pPr>
+        <w:ind w:left="3960" w:hanging="360"/>
+      </w:pPr>
+      <w:rPr>
+        <w:rFonts w:ascii="Courier New" w:hAnsi="Courier New" w:cs="Courier New" w:hint="default"/>
+      </w:rPr>
+    </w:lvl>
+    <w:lvl w:ilvl="5" w:tplc="08090005" w:tentative="1">
+      <w:start w:val="1"/>
+      <w:numFmt w:val="bullet"/>
+      <w:lvlText w:val=""/>
+      <w:lvlJc w:val="left"/>
+      <w:pPr>
+        <w:ind w:left="4680" w:hanging="360"/>
+      </w:pPr>
+      <w:rPr>
+        <w:rFonts w:ascii="Wingdings" w:hAnsi="Wingdings" w:hint="default"/>
+      </w:rPr>
+    </w:lvl>
+    <w:lvl w:ilvl="6" w:tplc="08090001" w:tentative="1">
+      <w:start w:val="1"/>
+      <w:numFmt w:val="bullet"/>
+      <w:lvlText w:val=""/>
+      <w:lvlJc w:val="left"/>
+      <w:pPr>
+        <w:ind w:left="5400" w:hanging="360"/>
+      </w:pPr>
+      <w:rPr>
+        <w:rFonts w:ascii="Symbol" w:hAnsi="Symbol" w:hint="default"/>
+      </w:rPr>
+    </w:lvl>
+    <w:lvl w:ilvl="7" w:tplc="08090003" w:tentative="1">
+      <w:start w:val="1"/>
+      <w:numFmt w:val="bullet"/>
+      <w:lvlText w:val="o"/>
+      <w:lvlJc w:val="left"/>
+      <w:pPr>
+        <w:ind w:left="6120" w:hanging="360"/>
+      </w:pPr>
+      <w:rPr>
+        <w:rFonts w:ascii="Courier New" w:hAnsi="Courier New" w:cs="Courier New" w:hint="default"/>
+      </w:rPr>
+    </w:lvl>
+    <w:lvl w:ilvl="8" w:tplc="08090005" w:tentative="1">
+      <w:start w:val="1"/>
+      <w:numFmt w:val="bullet"/>
+      <w:lvlText w:val=""/>
+      <w:lvlJc w:val="left"/>
+      <w:pPr>
+        <w:ind w:left="6840" w:hanging="360"/>
+      </w:pPr>
+      <w:rPr>
+        <w:rFonts w:ascii="Wingdings" w:hAnsi="Wingdings" w:hint="default"/>
+      </w:rPr>
+    </w:lvl>
+  </w:abstractNum>
+  <w:abstractNum w:abstractNumId="2" w15:restartNumberingAfterBreak="0">
     <w:nsid w:val="4CF1756E"/>
     <w:multiLevelType w:val="hybridMultilevel"/>
     <w:tmpl w:val="05666E0C"/>
@@ -2229,7 +2816,96 @@
       </w:pPr>
     </w:lvl>
   </w:abstractNum>
-  <w:abstractNum w:abstractNumId="2" w15:restartNumberingAfterBreak="0">
+  <w:abstractNum w:abstractNumId="3" w15:restartNumberingAfterBreak="0">
+    <w:nsid w:val="575A6994"/>
+    <w:multiLevelType w:val="hybridMultilevel"/>
+    <w:tmpl w:val="83BAF5B4"/>
+    <w:lvl w:ilvl="0" w:tplc="08090011">
+      <w:start w:val="1"/>
+      <w:numFmt w:val="decimal"/>
+      <w:lvlText w:val="%1)"/>
+      <w:lvlJc w:val="left"/>
+      <w:pPr>
+        <w:ind w:left="720" w:hanging="360"/>
+      </w:pPr>
+      <w:rPr>
+        <w:rFonts w:hint="default"/>
+      </w:rPr>
+    </w:lvl>
+    <w:lvl w:ilvl="1" w:tplc="08090019" w:tentative="1">
+      <w:start w:val="1"/>
+      <w:numFmt w:val="lowerLetter"/>
+      <w:lvlText w:val="%2."/>
+      <w:lvlJc w:val="left"/>
+      <w:pPr>
+        <w:ind w:left="1440" w:hanging="360"/>
+      </w:pPr>
+    </w:lvl>
+    <w:lvl w:ilvl="2" w:tplc="0809001B" w:tentative="1">
+      <w:start w:val="1"/>
+      <w:numFmt w:val="lowerRoman"/>
+      <w:lvlText w:val="%3."/>
+      <w:lvlJc w:val="right"/>
+      <w:pPr>
+        <w:ind w:left="2160" w:hanging="180"/>
+      </w:pPr>
+    </w:lvl>
+    <w:lvl w:ilvl="3" w:tplc="0809000F" w:tentative="1">
+      <w:start w:val="1"/>
+      <w:numFmt w:val="decimal"/>
+      <w:lvlText w:val="%4."/>
+      <w:lvlJc w:val="left"/>
+      <w:pPr>
+        <w:ind w:left="2880" w:hanging="360"/>
+      </w:pPr>
+    </w:lvl>
+    <w:lvl w:ilvl="4" w:tplc="08090019" w:tentative="1">
+      <w:start w:val="1"/>
+      <w:numFmt w:val="lowerLetter"/>
+      <w:lvlText w:val="%5."/>
+      <w:lvlJc w:val="left"/>
+      <w:pPr>
+        <w:ind w:left="3600" w:hanging="360"/>
+      </w:pPr>
+    </w:lvl>
+    <w:lvl w:ilvl="5" w:tplc="0809001B" w:tentative="1">
+      <w:start w:val="1"/>
+      <w:numFmt w:val="lowerRoman"/>
+      <w:lvlText w:val="%6."/>
+      <w:lvlJc w:val="right"/>
+      <w:pPr>
+        <w:ind w:left="4320" w:hanging="180"/>
+      </w:pPr>
+    </w:lvl>
+    <w:lvl w:ilvl="6" w:tplc="0809000F" w:tentative="1">
+      <w:start w:val="1"/>
+      <w:numFmt w:val="decimal"/>
+      <w:lvlText w:val="%7."/>
+      <w:lvlJc w:val="left"/>
+      <w:pPr>
+        <w:ind w:left="5040" w:hanging="360"/>
+      </w:pPr>
+    </w:lvl>
+    <w:lvl w:ilvl="7" w:tplc="08090019" w:tentative="1">
+      <w:start w:val="1"/>
+      <w:numFmt w:val="lowerLetter"/>
+      <w:lvlText w:val="%8."/>
+      <w:lvlJc w:val="left"/>
+      <w:pPr>
+        <w:ind w:left="5760" w:hanging="360"/>
+      </w:pPr>
+    </w:lvl>
+    <w:lvl w:ilvl="8" w:tplc="0809001B" w:tentative="1">
+      <w:start w:val="1"/>
+      <w:numFmt w:val="lowerRoman"/>
+      <w:lvlText w:val="%9."/>
+      <w:lvlJc w:val="right"/>
+      <w:pPr>
+        <w:ind w:left="6480" w:hanging="180"/>
+      </w:pPr>
+    </w:lvl>
+  </w:abstractNum>
+  <w:abstractNum w:abstractNumId="4" w15:restartNumberingAfterBreak="0">
     <w:nsid w:val="5AB0551A"/>
     <w:multiLevelType w:val="hybridMultilevel"/>
     <w:tmpl w:val="CF1A90E0"/>
@@ -2318,7 +2994,7 @@
       </w:pPr>
     </w:lvl>
   </w:abstractNum>
-  <w:abstractNum w:abstractNumId="3" w15:restartNumberingAfterBreak="0">
+  <w:abstractNum w:abstractNumId="5" w15:restartNumberingAfterBreak="0">
     <w:nsid w:val="5B5A5514"/>
     <w:multiLevelType w:val="hybridMultilevel"/>
     <w:tmpl w:val="25488A9A"/>
@@ -2407,7 +3083,7 @@
       </w:pPr>
     </w:lvl>
   </w:abstractNum>
-  <w:abstractNum w:abstractNumId="4" w15:restartNumberingAfterBreak="0">
+  <w:abstractNum w:abstractNumId="6" w15:restartNumberingAfterBreak="0">
     <w:nsid w:val="5BCA12AA"/>
     <w:multiLevelType w:val="hybridMultilevel"/>
     <w:tmpl w:val="B9D23A1E"/>
@@ -2496,7 +3172,7 @@
       </w:pPr>
     </w:lvl>
   </w:abstractNum>
-  <w:abstractNum w:abstractNumId="5" w15:restartNumberingAfterBreak="0">
+  <w:abstractNum w:abstractNumId="7" w15:restartNumberingAfterBreak="0">
     <w:nsid w:val="5BF46A39"/>
     <w:multiLevelType w:val="hybridMultilevel"/>
     <w:tmpl w:val="EBC442A0"/>
@@ -2609,7 +3285,7 @@
       </w:rPr>
     </w:lvl>
   </w:abstractNum>
-  <w:abstractNum w:abstractNumId="6" w15:restartNumberingAfterBreak="0">
+  <w:abstractNum w:abstractNumId="8" w15:restartNumberingAfterBreak="0">
     <w:nsid w:val="5F686F30"/>
     <w:multiLevelType w:val="hybridMultilevel"/>
     <w:tmpl w:val="FB6E4912"/>
@@ -2698,7 +3374,7 @@
       </w:pPr>
     </w:lvl>
   </w:abstractNum>
-  <w:abstractNum w:abstractNumId="7" w15:restartNumberingAfterBreak="0">
+  <w:abstractNum w:abstractNumId="9" w15:restartNumberingAfterBreak="0">
     <w:nsid w:val="6EA04E07"/>
     <w:multiLevelType w:val="hybridMultilevel"/>
     <w:tmpl w:val="F3C20374"/>
@@ -2787,29 +3463,266 @@
       </w:pPr>
     </w:lvl>
   </w:abstractNum>
+  <w:abstractNum w:abstractNumId="10" w15:restartNumberingAfterBreak="0">
+    <w:nsid w:val="771F3D13"/>
+    <w:multiLevelType w:val="hybridMultilevel"/>
+    <w:tmpl w:val="44ACE2F2"/>
+    <w:lvl w:ilvl="0" w:tplc="8BC46B6A">
+      <w:numFmt w:val="bullet"/>
+      <w:lvlText w:val="-"/>
+      <w:lvlJc w:val="left"/>
+      <w:pPr>
+        <w:ind w:left="1365" w:hanging="360"/>
+      </w:pPr>
+      <w:rPr>
+        <w:rFonts w:ascii="Calibri" w:eastAsiaTheme="minorHAnsi" w:hAnsi="Calibri" w:cs="Calibri" w:hint="default"/>
+      </w:rPr>
+    </w:lvl>
+    <w:lvl w:ilvl="1" w:tplc="08090003" w:tentative="1">
+      <w:start w:val="1"/>
+      <w:numFmt w:val="bullet"/>
+      <w:lvlText w:val="o"/>
+      <w:lvlJc w:val="left"/>
+      <w:pPr>
+        <w:ind w:left="2085" w:hanging="360"/>
+      </w:pPr>
+      <w:rPr>
+        <w:rFonts w:ascii="Courier New" w:hAnsi="Courier New" w:cs="Courier New" w:hint="default"/>
+      </w:rPr>
+    </w:lvl>
+    <w:lvl w:ilvl="2" w:tplc="08090005" w:tentative="1">
+      <w:start w:val="1"/>
+      <w:numFmt w:val="bullet"/>
+      <w:lvlText w:val=""/>
+      <w:lvlJc w:val="left"/>
+      <w:pPr>
+        <w:ind w:left="2805" w:hanging="360"/>
+      </w:pPr>
+      <w:rPr>
+        <w:rFonts w:ascii="Wingdings" w:hAnsi="Wingdings" w:hint="default"/>
+      </w:rPr>
+    </w:lvl>
+    <w:lvl w:ilvl="3" w:tplc="08090001" w:tentative="1">
+      <w:start w:val="1"/>
+      <w:numFmt w:val="bullet"/>
+      <w:lvlText w:val=""/>
+      <w:lvlJc w:val="left"/>
+      <w:pPr>
+        <w:ind w:left="3525" w:hanging="360"/>
+      </w:pPr>
+      <w:rPr>
+        <w:rFonts w:ascii="Symbol" w:hAnsi="Symbol" w:hint="default"/>
+      </w:rPr>
+    </w:lvl>
+    <w:lvl w:ilvl="4" w:tplc="08090003" w:tentative="1">
+      <w:start w:val="1"/>
+      <w:numFmt w:val="bullet"/>
+      <w:lvlText w:val="o"/>
+      <w:lvlJc w:val="left"/>
+      <w:pPr>
+        <w:ind w:left="4245" w:hanging="360"/>
+      </w:pPr>
+      <w:rPr>
+        <w:rFonts w:ascii="Courier New" w:hAnsi="Courier New" w:cs="Courier New" w:hint="default"/>
+      </w:rPr>
+    </w:lvl>
+    <w:lvl w:ilvl="5" w:tplc="08090005" w:tentative="1">
+      <w:start w:val="1"/>
+      <w:numFmt w:val="bullet"/>
+      <w:lvlText w:val=""/>
+      <w:lvlJc w:val="left"/>
+      <w:pPr>
+        <w:ind w:left="4965" w:hanging="360"/>
+      </w:pPr>
+      <w:rPr>
+        <w:rFonts w:ascii="Wingdings" w:hAnsi="Wingdings" w:hint="default"/>
+      </w:rPr>
+    </w:lvl>
+    <w:lvl w:ilvl="6" w:tplc="08090001" w:tentative="1">
+      <w:start w:val="1"/>
+      <w:numFmt w:val="bullet"/>
+      <w:lvlText w:val=""/>
+      <w:lvlJc w:val="left"/>
+      <w:pPr>
+        <w:ind w:left="5685" w:hanging="360"/>
+      </w:pPr>
+      <w:rPr>
+        <w:rFonts w:ascii="Symbol" w:hAnsi="Symbol" w:hint="default"/>
+      </w:rPr>
+    </w:lvl>
+    <w:lvl w:ilvl="7" w:tplc="08090003" w:tentative="1">
+      <w:start w:val="1"/>
+      <w:numFmt w:val="bullet"/>
+      <w:lvlText w:val="o"/>
+      <w:lvlJc w:val="left"/>
+      <w:pPr>
+        <w:ind w:left="6405" w:hanging="360"/>
+      </w:pPr>
+      <w:rPr>
+        <w:rFonts w:ascii="Courier New" w:hAnsi="Courier New" w:cs="Courier New" w:hint="default"/>
+      </w:rPr>
+    </w:lvl>
+    <w:lvl w:ilvl="8" w:tplc="08090005" w:tentative="1">
+      <w:start w:val="1"/>
+      <w:numFmt w:val="bullet"/>
+      <w:lvlText w:val=""/>
+      <w:lvlJc w:val="left"/>
+      <w:pPr>
+        <w:ind w:left="7125" w:hanging="360"/>
+      </w:pPr>
+      <w:rPr>
+        <w:rFonts w:ascii="Wingdings" w:hAnsi="Wingdings" w:hint="default"/>
+      </w:rPr>
+    </w:lvl>
+  </w:abstractNum>
+  <w:abstractNum w:abstractNumId="11" w15:restartNumberingAfterBreak="0">
+    <w:nsid w:val="7D44723A"/>
+    <w:multiLevelType w:val="hybridMultilevel"/>
+    <w:tmpl w:val="6BC031B6"/>
+    <w:lvl w:ilvl="0" w:tplc="4A4C983A">
+      <w:start w:val="5"/>
+      <w:numFmt w:val="bullet"/>
+      <w:lvlText w:val=""/>
+      <w:lvlJc w:val="left"/>
+      <w:pPr>
+        <w:ind w:left="720" w:hanging="360"/>
+      </w:pPr>
+      <w:rPr>
+        <w:rFonts w:ascii="Symbol" w:eastAsiaTheme="minorHAnsi" w:hAnsi="Symbol" w:cs="Calibri" w:hint="default"/>
+      </w:rPr>
+    </w:lvl>
+    <w:lvl w:ilvl="1" w:tplc="08090003" w:tentative="1">
+      <w:start w:val="1"/>
+      <w:numFmt w:val="bullet"/>
+      <w:lvlText w:val="o"/>
+      <w:lvlJc w:val="left"/>
+      <w:pPr>
+        <w:ind w:left="1440" w:hanging="360"/>
+      </w:pPr>
+      <w:rPr>
+        <w:rFonts w:ascii="Courier New" w:hAnsi="Courier New" w:cs="Courier New" w:hint="default"/>
+      </w:rPr>
+    </w:lvl>
+    <w:lvl w:ilvl="2" w:tplc="08090005" w:tentative="1">
+      <w:start w:val="1"/>
+      <w:numFmt w:val="bullet"/>
+      <w:lvlText w:val=""/>
+      <w:lvlJc w:val="left"/>
+      <w:pPr>
+        <w:ind w:left="2160" w:hanging="360"/>
+      </w:pPr>
+      <w:rPr>
+        <w:rFonts w:ascii="Wingdings" w:hAnsi="Wingdings" w:hint="default"/>
+      </w:rPr>
+    </w:lvl>
+    <w:lvl w:ilvl="3" w:tplc="08090001" w:tentative="1">
+      <w:start w:val="1"/>
+      <w:numFmt w:val="bullet"/>
+      <w:lvlText w:val=""/>
+      <w:lvlJc w:val="left"/>
+      <w:pPr>
+        <w:ind w:left="2880" w:hanging="360"/>
+      </w:pPr>
+      <w:rPr>
+        <w:rFonts w:ascii="Symbol" w:hAnsi="Symbol" w:hint="default"/>
+      </w:rPr>
+    </w:lvl>
+    <w:lvl w:ilvl="4" w:tplc="08090003" w:tentative="1">
+      <w:start w:val="1"/>
+      <w:numFmt w:val="bullet"/>
+      <w:lvlText w:val="o"/>
+      <w:lvlJc w:val="left"/>
+      <w:pPr>
+        <w:ind w:left="3600" w:hanging="360"/>
+      </w:pPr>
+      <w:rPr>
+        <w:rFonts w:ascii="Courier New" w:hAnsi="Courier New" w:cs="Courier New" w:hint="default"/>
+      </w:rPr>
+    </w:lvl>
+    <w:lvl w:ilvl="5" w:tplc="08090005" w:tentative="1">
+      <w:start w:val="1"/>
+      <w:numFmt w:val="bullet"/>
+      <w:lvlText w:val=""/>
+      <w:lvlJc w:val="left"/>
+      <w:pPr>
+        <w:ind w:left="4320" w:hanging="360"/>
+      </w:pPr>
+      <w:rPr>
+        <w:rFonts w:ascii="Wingdings" w:hAnsi="Wingdings" w:hint="default"/>
+      </w:rPr>
+    </w:lvl>
+    <w:lvl w:ilvl="6" w:tplc="08090001" w:tentative="1">
+      <w:start w:val="1"/>
+      <w:numFmt w:val="bullet"/>
+      <w:lvlText w:val=""/>
+      <w:lvlJc w:val="left"/>
+      <w:pPr>
+        <w:ind w:left="5040" w:hanging="360"/>
+      </w:pPr>
+      <w:rPr>
+        <w:rFonts w:ascii="Symbol" w:hAnsi="Symbol" w:hint="default"/>
+      </w:rPr>
+    </w:lvl>
+    <w:lvl w:ilvl="7" w:tplc="08090003" w:tentative="1">
+      <w:start w:val="1"/>
+      <w:numFmt w:val="bullet"/>
+      <w:lvlText w:val="o"/>
+      <w:lvlJc w:val="left"/>
+      <w:pPr>
+        <w:ind w:left="5760" w:hanging="360"/>
+      </w:pPr>
+      <w:rPr>
+        <w:rFonts w:ascii="Courier New" w:hAnsi="Courier New" w:cs="Courier New" w:hint="default"/>
+      </w:rPr>
+    </w:lvl>
+    <w:lvl w:ilvl="8" w:tplc="08090005" w:tentative="1">
+      <w:start w:val="1"/>
+      <w:numFmt w:val="bullet"/>
+      <w:lvlText w:val=""/>
+      <w:lvlJc w:val="left"/>
+      <w:pPr>
+        <w:ind w:left="6480" w:hanging="360"/>
+      </w:pPr>
+      <w:rPr>
+        <w:rFonts w:ascii="Wingdings" w:hAnsi="Wingdings" w:hint="default"/>
+      </w:rPr>
+    </w:lvl>
+  </w:abstractNum>
   <w:num w:numId="1" w16cid:durableId="1044871206">
-    <w:abstractNumId w:val="3"/>
+    <w:abstractNumId w:val="5"/>
   </w:num>
   <w:num w:numId="2" w16cid:durableId="1052343797">
+    <w:abstractNumId w:val="4"/>
+  </w:num>
+  <w:num w:numId="3" w16cid:durableId="1218737973">
     <w:abstractNumId w:val="2"/>
   </w:num>
-  <w:num w:numId="3" w16cid:durableId="1218737973">
-    <w:abstractNumId w:val="1"/>
-  </w:num>
   <w:num w:numId="4" w16cid:durableId="179318199">
-    <w:abstractNumId w:val="7"/>
+    <w:abstractNumId w:val="9"/>
   </w:num>
   <w:num w:numId="5" w16cid:durableId="1349063098">
     <w:abstractNumId w:val="0"/>
   </w:num>
   <w:num w:numId="6" w16cid:durableId="1638102282">
-    <w:abstractNumId w:val="4"/>
+    <w:abstractNumId w:val="6"/>
   </w:num>
   <w:num w:numId="7" w16cid:durableId="506095161">
-    <w:abstractNumId w:val="5"/>
+    <w:abstractNumId w:val="7"/>
   </w:num>
   <w:num w:numId="8" w16cid:durableId="958609661">
-    <w:abstractNumId w:val="6"/>
+    <w:abstractNumId w:val="8"/>
+  </w:num>
+  <w:num w:numId="9" w16cid:durableId="593364716">
+    <w:abstractNumId w:val="10"/>
+  </w:num>
+  <w:num w:numId="10" w16cid:durableId="621762484">
+    <w:abstractNumId w:val="1"/>
+  </w:num>
+  <w:num w:numId="11" w16cid:durableId="1210537537">
+    <w:abstractNumId w:val="3"/>
+  </w:num>
+  <w:num w:numId="12" w16cid:durableId="2026901125">
+    <w:abstractNumId w:val="11"/>
   </w:num>
 </w:numbering>
 </file>

</xml_diff>

<commit_message>
Research Methods Notes Sampling
</commit_message>
<xml_diff>
--- a/Research_Methods_Notes/Thinking About Research.docx
+++ b/Research_Methods_Notes/Thinking About Research.docx
@@ -308,13 +308,23 @@
           <w:szCs w:val="22"/>
         </w:rPr>
       </w:pPr>
-      <w:r>
-        <w:rPr>
-          <w:rFonts w:ascii="Calibri" w:hAnsi="Calibri" w:cs="Calibri"/>
-          <w:sz w:val="22"/>
-          <w:szCs w:val="22"/>
-        </w:rPr>
-        <w:t xml:space="preserve">Hypothesis ; A testable assertion about the relationship between things. </w:t>
+      <w:proofErr w:type="gramStart"/>
+      <w:r>
+        <w:rPr>
+          <w:rFonts w:ascii="Calibri" w:hAnsi="Calibri" w:cs="Calibri"/>
+          <w:sz w:val="22"/>
+          <w:szCs w:val="22"/>
+        </w:rPr>
+        <w:t>Hypothesis ;</w:t>
+      </w:r>
+      <w:proofErr w:type="gramEnd"/>
+      <w:r>
+        <w:rPr>
+          <w:rFonts w:ascii="Calibri" w:hAnsi="Calibri" w:cs="Calibri"/>
+          <w:sz w:val="22"/>
+          <w:szCs w:val="22"/>
+        </w:rPr>
+        <w:t xml:space="preserve"> A testable assertion about the relationship between things. </w:t>
       </w:r>
     </w:p>
     <w:p>
@@ -2889,8 +2899,18 @@
           <w:sz w:val="22"/>
           <w:szCs w:val="22"/>
         </w:rPr>
-        <w:t>What do you think the outcome of the work is ?</w:t>
-      </w:r>
+        <w:t xml:space="preserve">What do you think the outcome of the work </w:t>
+      </w:r>
+      <w:proofErr w:type="gramStart"/>
+      <w:r>
+        <w:rPr>
+          <w:rFonts w:ascii="Calibri" w:hAnsi="Calibri" w:cs="Calibri"/>
+          <w:sz w:val="22"/>
+          <w:szCs w:val="22"/>
+        </w:rPr>
+        <w:t>is ?</w:t>
+      </w:r>
+      <w:proofErr w:type="gramEnd"/>
     </w:p>
     <w:p>
       <w:pPr>
@@ -6098,6 +6118,7 @@
       <w:r>
         <w:rPr>
           <w:rFonts w:ascii="Calibri" w:hAnsi="Calibri" w:cs="Calibri"/>
+          <w:noProof/>
           <w:sz w:val="22"/>
           <w:szCs w:val="22"/>
         </w:rPr>
@@ -6266,6 +6287,649 @@
         <w:t xml:space="preserve">Qualitative methods can be used after to identify interesting characteristics. </w:t>
       </w:r>
     </w:p>
+    <w:p>
+      <w:pPr>
+        <w:tabs>
+          <w:tab w:val="left" w:pos="1005"/>
+        </w:tabs>
+        <w:rPr>
+          <w:rFonts w:ascii="Calibri" w:hAnsi="Calibri" w:cs="Calibri"/>
+          <w:b/>
+          <w:bCs/>
+          <w:sz w:val="22"/>
+          <w:szCs w:val="22"/>
+          <w:u w:val="single"/>
+        </w:rPr>
+      </w:pPr>
+      <w:r>
+        <w:rPr>
+          <w:rFonts w:ascii="Calibri" w:hAnsi="Calibri" w:cs="Calibri"/>
+          <w:sz w:val="22"/>
+          <w:szCs w:val="22"/>
+        </w:rPr>
+        <w:tab/>
+      </w:r>
+    </w:p>
+    <w:p>
+      <w:pPr>
+        <w:tabs>
+          <w:tab w:val="left" w:pos="1005"/>
+        </w:tabs>
+        <w:rPr>
+          <w:rFonts w:ascii="Calibri" w:hAnsi="Calibri" w:cs="Calibri"/>
+          <w:b/>
+          <w:bCs/>
+          <w:sz w:val="22"/>
+          <w:szCs w:val="22"/>
+          <w:u w:val="single"/>
+        </w:rPr>
+      </w:pPr>
+      <w:r>
+        <w:rPr>
+          <w:rFonts w:ascii="Calibri" w:hAnsi="Calibri" w:cs="Calibri"/>
+          <w:b/>
+          <w:bCs/>
+          <w:sz w:val="22"/>
+          <w:szCs w:val="22"/>
+        </w:rPr>
+        <w:lastRenderedPageBreak/>
+        <w:tab/>
+      </w:r>
+      <w:r>
+        <w:rPr>
+          <w:rFonts w:ascii="Calibri" w:hAnsi="Calibri" w:cs="Calibri"/>
+          <w:b/>
+          <w:bCs/>
+          <w:sz w:val="22"/>
+          <w:szCs w:val="22"/>
+          <w:u w:val="single"/>
+        </w:rPr>
+        <w:t>Sampling</w:t>
+      </w:r>
+    </w:p>
+    <w:p>
+      <w:pPr>
+        <w:pStyle w:val="ListParagraph"/>
+        <w:numPr>
+          <w:ilvl w:val="0"/>
+          <w:numId w:val="24"/>
+        </w:numPr>
+        <w:tabs>
+          <w:tab w:val="left" w:pos="1005"/>
+        </w:tabs>
+        <w:rPr>
+          <w:rFonts w:ascii="Calibri" w:hAnsi="Calibri" w:cs="Calibri"/>
+          <w:sz w:val="22"/>
+          <w:szCs w:val="22"/>
+        </w:rPr>
+      </w:pPr>
+      <w:r>
+        <w:rPr>
+          <w:rFonts w:ascii="Calibri" w:hAnsi="Calibri" w:cs="Calibri"/>
+          <w:sz w:val="22"/>
+          <w:szCs w:val="22"/>
+        </w:rPr>
+        <w:t xml:space="preserve">The </w:t>
+      </w:r>
+      <w:r>
+        <w:rPr>
+          <w:rFonts w:ascii="Calibri" w:hAnsi="Calibri" w:cs="Calibri"/>
+          <w:sz w:val="22"/>
+          <w:szCs w:val="22"/>
+        </w:rPr>
+        <w:t>selection of</w:t>
+      </w:r>
+      <w:r>
+        <w:rPr>
+          <w:rFonts w:ascii="Calibri" w:hAnsi="Calibri" w:cs="Calibri"/>
+          <w:sz w:val="22"/>
+          <w:szCs w:val="22"/>
+        </w:rPr>
+        <w:t xml:space="preserve"> cases </w:t>
+      </w:r>
+      <w:r>
+        <w:rPr>
+          <w:rFonts w:ascii="Calibri" w:hAnsi="Calibri" w:cs="Calibri"/>
+          <w:sz w:val="22"/>
+          <w:szCs w:val="22"/>
+        </w:rPr>
+        <w:t>from</w:t>
+      </w:r>
+      <w:r>
+        <w:rPr>
+          <w:rFonts w:ascii="Calibri" w:hAnsi="Calibri" w:cs="Calibri"/>
+          <w:sz w:val="22"/>
+          <w:szCs w:val="22"/>
+        </w:rPr>
+        <w:t xml:space="preserve"> larger group of cases is known as sampling. </w:t>
+      </w:r>
+      <w:r>
+        <w:rPr>
+          <w:rFonts w:ascii="Calibri" w:hAnsi="Calibri" w:cs="Calibri"/>
+          <w:sz w:val="22"/>
+          <w:szCs w:val="22"/>
+        </w:rPr>
+        <w:t xml:space="preserve">This is an extension of research </w:t>
+      </w:r>
+      <w:r>
+        <w:rPr>
+          <w:rFonts w:ascii="Calibri" w:hAnsi="Calibri" w:cs="Calibri"/>
+          <w:sz w:val="22"/>
+          <w:szCs w:val="22"/>
+        </w:rPr>
+        <w:t>design,</w:t>
+      </w:r>
+      <w:r>
+        <w:rPr>
+          <w:rFonts w:ascii="Calibri" w:hAnsi="Calibri" w:cs="Calibri"/>
+          <w:sz w:val="22"/>
+          <w:szCs w:val="22"/>
+        </w:rPr>
+        <w:t xml:space="preserve"> strategy and methods. </w:t>
+      </w:r>
+    </w:p>
+    <w:p>
+      <w:pPr>
+        <w:pStyle w:val="ListParagraph"/>
+        <w:numPr>
+          <w:ilvl w:val="0"/>
+          <w:numId w:val="24"/>
+        </w:numPr>
+        <w:tabs>
+          <w:tab w:val="left" w:pos="1005"/>
+        </w:tabs>
+        <w:rPr>
+          <w:rFonts w:ascii="Calibri" w:hAnsi="Calibri" w:cs="Calibri"/>
+          <w:sz w:val="22"/>
+          <w:szCs w:val="22"/>
+        </w:rPr>
+      </w:pPr>
+      <w:r>
+        <w:rPr>
+          <w:rFonts w:ascii="Calibri" w:hAnsi="Calibri" w:cs="Calibri"/>
+          <w:sz w:val="22"/>
+          <w:szCs w:val="22"/>
+        </w:rPr>
+        <w:t xml:space="preserve">The sampling techniques are son a spectrum: </w:t>
+      </w:r>
+    </w:p>
+    <w:p>
+      <w:pPr>
+        <w:tabs>
+          <w:tab w:val="left" w:pos="1005"/>
+        </w:tabs>
+        <w:rPr>
+          <w:rFonts w:ascii="Calibri" w:hAnsi="Calibri" w:cs="Calibri"/>
+          <w:sz w:val="22"/>
+          <w:szCs w:val="22"/>
+        </w:rPr>
+      </w:pPr>
+      <w:r>
+        <w:rPr>
+          <w:rFonts w:ascii="Calibri" w:hAnsi="Calibri" w:cs="Calibri"/>
+          <w:sz w:val="22"/>
+          <w:szCs w:val="22"/>
+        </w:rPr>
+        <w:drawing>
+          <wp:inline distT="0" distB="0" distL="0" distR="0" wp14:anchorId="7244D63C" wp14:editId="5ADA8E2A">
+            <wp:extent cx="4488873" cy="1146836"/>
+            <wp:effectExtent l="0" t="0" r="6985" b="0"/>
+            <wp:docPr id="1662525740" name="Picture 1" descr="A close-up of a sample&#10;&#10;AI-generated content may be incorrect."/>
+            <wp:cNvGraphicFramePr>
+              <a:graphicFrameLocks xmlns:a="http://schemas.openxmlformats.org/drawingml/2006/main" noChangeAspect="1"/>
+            </wp:cNvGraphicFramePr>
+            <a:graphic xmlns:a="http://schemas.openxmlformats.org/drawingml/2006/main">
+              <a:graphicData uri="http://schemas.openxmlformats.org/drawingml/2006/picture">
+                <pic:pic xmlns:pic="http://schemas.openxmlformats.org/drawingml/2006/picture">
+                  <pic:nvPicPr>
+                    <pic:cNvPr id="1662525740" name="Picture 1" descr="A close-up of a sample&#10;&#10;AI-generated content may be incorrect."/>
+                    <pic:cNvPicPr/>
+                  </pic:nvPicPr>
+                  <pic:blipFill>
+                    <a:blip r:embed="rId11"/>
+                    <a:stretch>
+                      <a:fillRect/>
+                    </a:stretch>
+                  </pic:blipFill>
+                  <pic:spPr>
+                    <a:xfrm>
+                      <a:off x="0" y="0"/>
+                      <a:ext cx="4504072" cy="1150719"/>
+                    </a:xfrm>
+                    <a:prstGeom prst="rect">
+                      <a:avLst/>
+                    </a:prstGeom>
+                  </pic:spPr>
+                </pic:pic>
+              </a:graphicData>
+            </a:graphic>
+          </wp:inline>
+        </w:drawing>
+      </w:r>
+    </w:p>
+    <w:p>
+      <w:pPr>
+        <w:pStyle w:val="ListParagraph"/>
+        <w:numPr>
+          <w:ilvl w:val="0"/>
+          <w:numId w:val="25"/>
+        </w:numPr>
+        <w:tabs>
+          <w:tab w:val="left" w:pos="1005"/>
+        </w:tabs>
+        <w:rPr>
+          <w:rFonts w:ascii="Calibri" w:hAnsi="Calibri" w:cs="Calibri"/>
+          <w:sz w:val="22"/>
+          <w:szCs w:val="22"/>
+        </w:rPr>
+      </w:pPr>
+      <w:r>
+        <w:rPr>
+          <w:rFonts w:ascii="Calibri" w:hAnsi="Calibri" w:cs="Calibri"/>
+          <w:sz w:val="22"/>
+          <w:szCs w:val="22"/>
+        </w:rPr>
+        <w:t xml:space="preserve">In an ideal sense, you use the entire population. But sometimes it’s necessary to use samples to capture the cases. This will sometimes require the use of </w:t>
+      </w:r>
+      <w:r>
+        <w:rPr>
+          <w:rFonts w:ascii="Calibri" w:hAnsi="Calibri" w:cs="Calibri"/>
+          <w:b/>
+          <w:bCs/>
+          <w:sz w:val="22"/>
+          <w:szCs w:val="22"/>
+        </w:rPr>
+        <w:t>stratification</w:t>
+      </w:r>
+      <w:r>
+        <w:rPr>
+          <w:rFonts w:ascii="Calibri" w:hAnsi="Calibri" w:cs="Calibri"/>
+          <w:sz w:val="22"/>
+          <w:szCs w:val="22"/>
+        </w:rPr>
+        <w:t xml:space="preserve"> (</w:t>
+      </w:r>
+      <w:r>
+        <w:rPr>
+          <w:rFonts w:ascii="Calibri" w:hAnsi="Calibri" w:cs="Calibri"/>
+          <w:sz w:val="22"/>
+          <w:szCs w:val="22"/>
+        </w:rPr>
+        <w:t>making the sample look more like the population)</w:t>
+      </w:r>
+      <w:r>
+        <w:rPr>
+          <w:rFonts w:ascii="Calibri" w:hAnsi="Calibri" w:cs="Calibri"/>
+          <w:sz w:val="22"/>
+          <w:szCs w:val="22"/>
+        </w:rPr>
+        <w:t>. This would mean that the sample me</w:t>
+      </w:r>
+      <w:r>
+        <w:rPr>
+          <w:rFonts w:ascii="Calibri" w:hAnsi="Calibri" w:cs="Calibri"/>
+          <w:sz w:val="22"/>
+          <w:szCs w:val="22"/>
+        </w:rPr>
+        <w:t xml:space="preserve">an is closer to the population mean lowering the </w:t>
+      </w:r>
+      <w:r>
+        <w:rPr>
+          <w:rFonts w:ascii="Calibri" w:hAnsi="Calibri" w:cs="Calibri"/>
+          <w:b/>
+          <w:bCs/>
+          <w:sz w:val="22"/>
+          <w:szCs w:val="22"/>
+        </w:rPr>
+        <w:t>sampling error</w:t>
+      </w:r>
+      <w:r>
+        <w:rPr>
+          <w:rFonts w:ascii="Calibri" w:hAnsi="Calibri" w:cs="Calibri"/>
+          <w:b/>
+          <w:bCs/>
+          <w:sz w:val="22"/>
+          <w:szCs w:val="22"/>
+        </w:rPr>
+        <w:t xml:space="preserve">. </w:t>
+      </w:r>
+    </w:p>
+    <w:p>
+      <w:pPr>
+        <w:pStyle w:val="ListParagraph"/>
+        <w:numPr>
+          <w:ilvl w:val="0"/>
+          <w:numId w:val="25"/>
+        </w:numPr>
+        <w:tabs>
+          <w:tab w:val="left" w:pos="1005"/>
+        </w:tabs>
+        <w:rPr>
+          <w:rFonts w:ascii="Calibri" w:hAnsi="Calibri" w:cs="Calibri"/>
+          <w:sz w:val="22"/>
+          <w:szCs w:val="22"/>
+        </w:rPr>
+      </w:pPr>
+      <w:r>
+        <w:rPr>
+          <w:rFonts w:ascii="Calibri" w:hAnsi="Calibri" w:cs="Calibri"/>
+          <w:sz w:val="22"/>
+          <w:szCs w:val="22"/>
+        </w:rPr>
+        <w:t xml:space="preserve">Non -probabilistic sampling is there </w:t>
+      </w:r>
+      <w:r>
+        <w:rPr>
+          <w:rFonts w:ascii="Calibri" w:hAnsi="Calibri" w:cs="Calibri"/>
+          <w:sz w:val="22"/>
+          <w:szCs w:val="22"/>
+        </w:rPr>
+        <w:t xml:space="preserve">to enable the researcher to explore the research question or to develop a theory </w:t>
+      </w:r>
+    </w:p>
+    <w:p>
+      <w:pPr>
+        <w:pStyle w:val="ListParagraph"/>
+        <w:numPr>
+          <w:ilvl w:val="0"/>
+          <w:numId w:val="25"/>
+        </w:numPr>
+        <w:tabs>
+          <w:tab w:val="left" w:pos="1005"/>
+        </w:tabs>
+        <w:rPr>
+          <w:rFonts w:ascii="Calibri" w:hAnsi="Calibri" w:cs="Calibri"/>
+          <w:sz w:val="22"/>
+          <w:szCs w:val="22"/>
+        </w:rPr>
+      </w:pPr>
+      <w:r>
+        <w:rPr>
+          <w:rFonts w:ascii="Calibri" w:hAnsi="Calibri" w:cs="Calibri"/>
+          <w:sz w:val="22"/>
+          <w:szCs w:val="22"/>
+        </w:rPr>
+        <w:drawing>
+          <wp:anchor distT="0" distB="0" distL="114300" distR="114300" simplePos="0" relativeHeight="251661312" behindDoc="0" locked="0" layoutInCell="1" allowOverlap="1" wp14:anchorId="3C4C2E73" wp14:editId="448C156D">
+            <wp:simplePos x="0" y="0"/>
+            <wp:positionH relativeFrom="column">
+              <wp:posOffset>118192</wp:posOffset>
+            </wp:positionH>
+            <wp:positionV relativeFrom="paragraph">
+              <wp:posOffset>233045</wp:posOffset>
+            </wp:positionV>
+            <wp:extent cx="4559935" cy="5014595"/>
+            <wp:effectExtent l="0" t="0" r="0" b="0"/>
+            <wp:wrapSquare wrapText="bothSides"/>
+            <wp:docPr id="1456964950" name="Picture 1" descr="A diagram of scientific research&#10;&#10;AI-generated content may be incorrect."/>
+            <wp:cNvGraphicFramePr>
+              <a:graphicFrameLocks xmlns:a="http://schemas.openxmlformats.org/drawingml/2006/main" noChangeAspect="1"/>
+            </wp:cNvGraphicFramePr>
+            <a:graphic xmlns:a="http://schemas.openxmlformats.org/drawingml/2006/main">
+              <a:graphicData uri="http://schemas.openxmlformats.org/drawingml/2006/picture">
+                <pic:pic xmlns:pic="http://schemas.openxmlformats.org/drawingml/2006/picture">
+                  <pic:nvPicPr>
+                    <pic:cNvPr id="1456964950" name="Picture 1" descr="A diagram of scientific research&#10;&#10;AI-generated content may be incorrect."/>
+                    <pic:cNvPicPr/>
+                  </pic:nvPicPr>
+                  <pic:blipFill>
+                    <a:blip r:embed="rId12">
+                      <a:extLst>
+                        <a:ext uri="{28A0092B-C50C-407E-A947-70E740481C1C}">
+                          <a14:useLocalDpi xmlns:a14="http://schemas.microsoft.com/office/drawing/2010/main" val="0"/>
+                        </a:ext>
+                      </a:extLst>
+                    </a:blip>
+                    <a:stretch>
+                      <a:fillRect/>
+                    </a:stretch>
+                  </pic:blipFill>
+                  <pic:spPr>
+                    <a:xfrm>
+                      <a:off x="0" y="0"/>
+                      <a:ext cx="4559935" cy="5014595"/>
+                    </a:xfrm>
+                    <a:prstGeom prst="rect">
+                      <a:avLst/>
+                    </a:prstGeom>
+                  </pic:spPr>
+                </pic:pic>
+              </a:graphicData>
+            </a:graphic>
+            <wp14:sizeRelH relativeFrom="margin">
+              <wp14:pctWidth>0</wp14:pctWidth>
+            </wp14:sizeRelH>
+            <wp14:sizeRelV relativeFrom="margin">
+              <wp14:pctHeight>0</wp14:pctHeight>
+            </wp14:sizeRelV>
+          </wp:anchor>
+        </w:drawing>
+      </w:r>
+      <w:r>
+        <w:rPr>
+          <w:rFonts w:ascii="Calibri" w:hAnsi="Calibri" w:cs="Calibri"/>
+          <w:sz w:val="22"/>
+          <w:szCs w:val="22"/>
+        </w:rPr>
+        <w:t xml:space="preserve">How do they fit together: </w:t>
+      </w:r>
+    </w:p>
+    <w:p>
+      <w:pPr>
+        <w:tabs>
+          <w:tab w:val="left" w:pos="1005"/>
+        </w:tabs>
+        <w:rPr>
+          <w:rFonts w:ascii="Calibri" w:hAnsi="Calibri" w:cs="Calibri"/>
+          <w:sz w:val="22"/>
+          <w:szCs w:val="22"/>
+        </w:rPr>
+      </w:pPr>
+    </w:p>
+    <w:p>
+      <w:pPr>
+        <w:tabs>
+          <w:tab w:val="left" w:pos="1005"/>
+        </w:tabs>
+        <w:rPr>
+          <w:rFonts w:ascii="Calibri" w:hAnsi="Calibri" w:cs="Calibri"/>
+          <w:sz w:val="22"/>
+          <w:szCs w:val="22"/>
+        </w:rPr>
+      </w:pPr>
+    </w:p>
+    <w:p>
+      <w:pPr>
+        <w:tabs>
+          <w:tab w:val="left" w:pos="1005"/>
+        </w:tabs>
+        <w:rPr>
+          <w:rFonts w:ascii="Calibri" w:hAnsi="Calibri" w:cs="Calibri"/>
+          <w:sz w:val="22"/>
+          <w:szCs w:val="22"/>
+        </w:rPr>
+      </w:pPr>
+    </w:p>
+    <w:p>
+      <w:pPr>
+        <w:tabs>
+          <w:tab w:val="left" w:pos="1005"/>
+        </w:tabs>
+        <w:rPr>
+          <w:rFonts w:ascii="Calibri" w:hAnsi="Calibri" w:cs="Calibri"/>
+          <w:sz w:val="22"/>
+          <w:szCs w:val="22"/>
+        </w:rPr>
+      </w:pPr>
+    </w:p>
+    <w:p>
+      <w:pPr>
+        <w:tabs>
+          <w:tab w:val="left" w:pos="1005"/>
+        </w:tabs>
+        <w:rPr>
+          <w:rFonts w:ascii="Calibri" w:hAnsi="Calibri" w:cs="Calibri"/>
+          <w:sz w:val="22"/>
+          <w:szCs w:val="22"/>
+        </w:rPr>
+      </w:pPr>
+    </w:p>
+    <w:p>
+      <w:pPr>
+        <w:tabs>
+          <w:tab w:val="left" w:pos="1005"/>
+        </w:tabs>
+        <w:rPr>
+          <w:rFonts w:ascii="Calibri" w:hAnsi="Calibri" w:cs="Calibri"/>
+          <w:sz w:val="22"/>
+          <w:szCs w:val="22"/>
+        </w:rPr>
+      </w:pPr>
+    </w:p>
+    <w:p>
+      <w:pPr>
+        <w:tabs>
+          <w:tab w:val="left" w:pos="1005"/>
+        </w:tabs>
+        <w:rPr>
+          <w:rFonts w:ascii="Calibri" w:hAnsi="Calibri" w:cs="Calibri"/>
+          <w:sz w:val="22"/>
+          <w:szCs w:val="22"/>
+        </w:rPr>
+      </w:pPr>
+    </w:p>
+    <w:p>
+      <w:pPr>
+        <w:tabs>
+          <w:tab w:val="left" w:pos="1005"/>
+        </w:tabs>
+        <w:rPr>
+          <w:rFonts w:ascii="Calibri" w:hAnsi="Calibri" w:cs="Calibri"/>
+          <w:sz w:val="22"/>
+          <w:szCs w:val="22"/>
+        </w:rPr>
+      </w:pPr>
+    </w:p>
+    <w:p>
+      <w:pPr>
+        <w:tabs>
+          <w:tab w:val="left" w:pos="1005"/>
+        </w:tabs>
+        <w:rPr>
+          <w:rFonts w:ascii="Calibri" w:hAnsi="Calibri" w:cs="Calibri"/>
+          <w:sz w:val="22"/>
+          <w:szCs w:val="22"/>
+        </w:rPr>
+      </w:pPr>
+    </w:p>
+    <w:p>
+      <w:pPr>
+        <w:tabs>
+          <w:tab w:val="left" w:pos="1005"/>
+        </w:tabs>
+        <w:rPr>
+          <w:rFonts w:ascii="Calibri" w:hAnsi="Calibri" w:cs="Calibri"/>
+          <w:sz w:val="22"/>
+          <w:szCs w:val="22"/>
+        </w:rPr>
+      </w:pPr>
+    </w:p>
+    <w:p>
+      <w:pPr>
+        <w:tabs>
+          <w:tab w:val="left" w:pos="1005"/>
+        </w:tabs>
+        <w:rPr>
+          <w:rFonts w:ascii="Calibri" w:hAnsi="Calibri" w:cs="Calibri"/>
+          <w:sz w:val="22"/>
+          <w:szCs w:val="22"/>
+        </w:rPr>
+      </w:pPr>
+    </w:p>
+    <w:p>
+      <w:pPr>
+        <w:tabs>
+          <w:tab w:val="left" w:pos="1005"/>
+        </w:tabs>
+        <w:rPr>
+          <w:rFonts w:ascii="Calibri" w:hAnsi="Calibri" w:cs="Calibri"/>
+          <w:sz w:val="22"/>
+          <w:szCs w:val="22"/>
+        </w:rPr>
+      </w:pPr>
+    </w:p>
+    <w:p>
+      <w:pPr>
+        <w:tabs>
+          <w:tab w:val="left" w:pos="1005"/>
+        </w:tabs>
+        <w:rPr>
+          <w:rFonts w:ascii="Calibri" w:hAnsi="Calibri" w:cs="Calibri"/>
+          <w:sz w:val="22"/>
+          <w:szCs w:val="22"/>
+        </w:rPr>
+      </w:pPr>
+    </w:p>
+    <w:p>
+      <w:pPr>
+        <w:tabs>
+          <w:tab w:val="left" w:pos="1005"/>
+        </w:tabs>
+        <w:rPr>
+          <w:rFonts w:ascii="Calibri" w:hAnsi="Calibri" w:cs="Calibri"/>
+          <w:sz w:val="22"/>
+          <w:szCs w:val="22"/>
+        </w:rPr>
+      </w:pPr>
+    </w:p>
+    <w:p>
+      <w:pPr>
+        <w:tabs>
+          <w:tab w:val="left" w:pos="1005"/>
+        </w:tabs>
+        <w:rPr>
+          <w:rFonts w:ascii="Calibri" w:hAnsi="Calibri" w:cs="Calibri"/>
+          <w:sz w:val="22"/>
+          <w:szCs w:val="22"/>
+        </w:rPr>
+      </w:pPr>
+    </w:p>
+    <w:p>
+      <w:pPr>
+        <w:tabs>
+          <w:tab w:val="left" w:pos="1005"/>
+        </w:tabs>
+        <w:rPr>
+          <w:rFonts w:ascii="Calibri" w:hAnsi="Calibri" w:cs="Calibri"/>
+          <w:sz w:val="22"/>
+          <w:szCs w:val="22"/>
+        </w:rPr>
+      </w:pPr>
+    </w:p>
+    <w:p>
+      <w:pPr>
+        <w:tabs>
+          <w:tab w:val="left" w:pos="1005"/>
+        </w:tabs>
+        <w:rPr>
+          <w:rFonts w:ascii="Calibri" w:hAnsi="Calibri" w:cs="Calibri"/>
+          <w:sz w:val="22"/>
+          <w:szCs w:val="22"/>
+        </w:rPr>
+      </w:pPr>
+    </w:p>
+    <w:p>
+      <w:pPr>
+        <w:tabs>
+          <w:tab w:val="left" w:pos="1005"/>
+        </w:tabs>
+        <w:rPr>
+          <w:rFonts w:ascii="Calibri" w:hAnsi="Calibri" w:cs="Calibri"/>
+          <w:sz w:val="22"/>
+          <w:szCs w:val="22"/>
+        </w:rPr>
+      </w:pPr>
+    </w:p>
     <w:sectPr>
       <w:pgSz w:w="11906" w:h="16838"/>
       <w:pgMar w:top="1440" w:right="1440" w:bottom="1440" w:left="1440" w:header="708" w:footer="708" w:gutter="0"/>
@@ -6368,6 +7032,119 @@
     </w:lvl>
   </w:abstractNum>
   <w:abstractNum w:abstractNumId="1" w15:restartNumberingAfterBreak="0">
+    <w:nsid w:val="17D90561"/>
+    <w:multiLevelType w:val="hybridMultilevel"/>
+    <w:tmpl w:val="FF88A54C"/>
+    <w:lvl w:ilvl="0" w:tplc="08090001">
+      <w:start w:val="1"/>
+      <w:numFmt w:val="bullet"/>
+      <w:lvlText w:val=""/>
+      <w:lvlJc w:val="left"/>
+      <w:pPr>
+        <w:ind w:left="720" w:hanging="360"/>
+      </w:pPr>
+      <w:rPr>
+        <w:rFonts w:ascii="Symbol" w:hAnsi="Symbol" w:hint="default"/>
+      </w:rPr>
+    </w:lvl>
+    <w:lvl w:ilvl="1" w:tplc="08090003" w:tentative="1">
+      <w:start w:val="1"/>
+      <w:numFmt w:val="bullet"/>
+      <w:lvlText w:val="o"/>
+      <w:lvlJc w:val="left"/>
+      <w:pPr>
+        <w:ind w:left="1440" w:hanging="360"/>
+      </w:pPr>
+      <w:rPr>
+        <w:rFonts w:ascii="Courier New" w:hAnsi="Courier New" w:cs="Courier New" w:hint="default"/>
+      </w:rPr>
+    </w:lvl>
+    <w:lvl w:ilvl="2" w:tplc="08090005" w:tentative="1">
+      <w:start w:val="1"/>
+      <w:numFmt w:val="bullet"/>
+      <w:lvlText w:val=""/>
+      <w:lvlJc w:val="left"/>
+      <w:pPr>
+        <w:ind w:left="2160" w:hanging="360"/>
+      </w:pPr>
+      <w:rPr>
+        <w:rFonts w:ascii="Wingdings" w:hAnsi="Wingdings" w:hint="default"/>
+      </w:rPr>
+    </w:lvl>
+    <w:lvl w:ilvl="3" w:tplc="08090001" w:tentative="1">
+      <w:start w:val="1"/>
+      <w:numFmt w:val="bullet"/>
+      <w:lvlText w:val=""/>
+      <w:lvlJc w:val="left"/>
+      <w:pPr>
+        <w:ind w:left="2880" w:hanging="360"/>
+      </w:pPr>
+      <w:rPr>
+        <w:rFonts w:ascii="Symbol" w:hAnsi="Symbol" w:hint="default"/>
+      </w:rPr>
+    </w:lvl>
+    <w:lvl w:ilvl="4" w:tplc="08090003" w:tentative="1">
+      <w:start w:val="1"/>
+      <w:numFmt w:val="bullet"/>
+      <w:lvlText w:val="o"/>
+      <w:lvlJc w:val="left"/>
+      <w:pPr>
+        <w:ind w:left="3600" w:hanging="360"/>
+      </w:pPr>
+      <w:rPr>
+        <w:rFonts w:ascii="Courier New" w:hAnsi="Courier New" w:cs="Courier New" w:hint="default"/>
+      </w:rPr>
+    </w:lvl>
+    <w:lvl w:ilvl="5" w:tplc="08090005" w:tentative="1">
+      <w:start w:val="1"/>
+      <w:numFmt w:val="bullet"/>
+      <w:lvlText w:val=""/>
+      <w:lvlJc w:val="left"/>
+      <w:pPr>
+        <w:ind w:left="4320" w:hanging="360"/>
+      </w:pPr>
+      <w:rPr>
+        <w:rFonts w:ascii="Wingdings" w:hAnsi="Wingdings" w:hint="default"/>
+      </w:rPr>
+    </w:lvl>
+    <w:lvl w:ilvl="6" w:tplc="08090001" w:tentative="1">
+      <w:start w:val="1"/>
+      <w:numFmt w:val="bullet"/>
+      <w:lvlText w:val=""/>
+      <w:lvlJc w:val="left"/>
+      <w:pPr>
+        <w:ind w:left="5040" w:hanging="360"/>
+      </w:pPr>
+      <w:rPr>
+        <w:rFonts w:ascii="Symbol" w:hAnsi="Symbol" w:hint="default"/>
+      </w:rPr>
+    </w:lvl>
+    <w:lvl w:ilvl="7" w:tplc="08090003" w:tentative="1">
+      <w:start w:val="1"/>
+      <w:numFmt w:val="bullet"/>
+      <w:lvlText w:val="o"/>
+      <w:lvlJc w:val="left"/>
+      <w:pPr>
+        <w:ind w:left="5760" w:hanging="360"/>
+      </w:pPr>
+      <w:rPr>
+        <w:rFonts w:ascii="Courier New" w:hAnsi="Courier New" w:cs="Courier New" w:hint="default"/>
+      </w:rPr>
+    </w:lvl>
+    <w:lvl w:ilvl="8" w:tplc="08090005" w:tentative="1">
+      <w:start w:val="1"/>
+      <w:numFmt w:val="bullet"/>
+      <w:lvlText w:val=""/>
+      <w:lvlJc w:val="left"/>
+      <w:pPr>
+        <w:ind w:left="6480" w:hanging="360"/>
+      </w:pPr>
+      <w:rPr>
+        <w:rFonts w:ascii="Wingdings" w:hAnsi="Wingdings" w:hint="default"/>
+      </w:rPr>
+    </w:lvl>
+  </w:abstractNum>
+  <w:abstractNum w:abstractNumId="2" w15:restartNumberingAfterBreak="0">
     <w:nsid w:val="1C39754B"/>
     <w:multiLevelType w:val="multilevel"/>
     <w:tmpl w:val="1E66836A"/>
@@ -6511,7 +7288,120 @@
       </w:rPr>
     </w:lvl>
   </w:abstractNum>
-  <w:abstractNum w:abstractNumId="2" w15:restartNumberingAfterBreak="0">
+  <w:abstractNum w:abstractNumId="3" w15:restartNumberingAfterBreak="0">
+    <w:nsid w:val="1E5B31B4"/>
+    <w:multiLevelType w:val="hybridMultilevel"/>
+    <w:tmpl w:val="676C2B54"/>
+    <w:lvl w:ilvl="0" w:tplc="08090001">
+      <w:start w:val="1"/>
+      <w:numFmt w:val="bullet"/>
+      <w:lvlText w:val=""/>
+      <w:lvlJc w:val="left"/>
+      <w:pPr>
+        <w:ind w:left="720" w:hanging="360"/>
+      </w:pPr>
+      <w:rPr>
+        <w:rFonts w:ascii="Symbol" w:hAnsi="Symbol" w:hint="default"/>
+      </w:rPr>
+    </w:lvl>
+    <w:lvl w:ilvl="1" w:tplc="08090003" w:tentative="1">
+      <w:start w:val="1"/>
+      <w:numFmt w:val="bullet"/>
+      <w:lvlText w:val="o"/>
+      <w:lvlJc w:val="left"/>
+      <w:pPr>
+        <w:ind w:left="1440" w:hanging="360"/>
+      </w:pPr>
+      <w:rPr>
+        <w:rFonts w:ascii="Courier New" w:hAnsi="Courier New" w:cs="Courier New" w:hint="default"/>
+      </w:rPr>
+    </w:lvl>
+    <w:lvl w:ilvl="2" w:tplc="08090005" w:tentative="1">
+      <w:start w:val="1"/>
+      <w:numFmt w:val="bullet"/>
+      <w:lvlText w:val=""/>
+      <w:lvlJc w:val="left"/>
+      <w:pPr>
+        <w:ind w:left="2160" w:hanging="360"/>
+      </w:pPr>
+      <w:rPr>
+        <w:rFonts w:ascii="Wingdings" w:hAnsi="Wingdings" w:hint="default"/>
+      </w:rPr>
+    </w:lvl>
+    <w:lvl w:ilvl="3" w:tplc="08090001" w:tentative="1">
+      <w:start w:val="1"/>
+      <w:numFmt w:val="bullet"/>
+      <w:lvlText w:val=""/>
+      <w:lvlJc w:val="left"/>
+      <w:pPr>
+        <w:ind w:left="2880" w:hanging="360"/>
+      </w:pPr>
+      <w:rPr>
+        <w:rFonts w:ascii="Symbol" w:hAnsi="Symbol" w:hint="default"/>
+      </w:rPr>
+    </w:lvl>
+    <w:lvl w:ilvl="4" w:tplc="08090003" w:tentative="1">
+      <w:start w:val="1"/>
+      <w:numFmt w:val="bullet"/>
+      <w:lvlText w:val="o"/>
+      <w:lvlJc w:val="left"/>
+      <w:pPr>
+        <w:ind w:left="3600" w:hanging="360"/>
+      </w:pPr>
+      <w:rPr>
+        <w:rFonts w:ascii="Courier New" w:hAnsi="Courier New" w:cs="Courier New" w:hint="default"/>
+      </w:rPr>
+    </w:lvl>
+    <w:lvl w:ilvl="5" w:tplc="08090005" w:tentative="1">
+      <w:start w:val="1"/>
+      <w:numFmt w:val="bullet"/>
+      <w:lvlText w:val=""/>
+      <w:lvlJc w:val="left"/>
+      <w:pPr>
+        <w:ind w:left="4320" w:hanging="360"/>
+      </w:pPr>
+      <w:rPr>
+        <w:rFonts w:ascii="Wingdings" w:hAnsi="Wingdings" w:hint="default"/>
+      </w:rPr>
+    </w:lvl>
+    <w:lvl w:ilvl="6" w:tplc="08090001" w:tentative="1">
+      <w:start w:val="1"/>
+      <w:numFmt w:val="bullet"/>
+      <w:lvlText w:val=""/>
+      <w:lvlJc w:val="left"/>
+      <w:pPr>
+        <w:ind w:left="5040" w:hanging="360"/>
+      </w:pPr>
+      <w:rPr>
+        <w:rFonts w:ascii="Symbol" w:hAnsi="Symbol" w:hint="default"/>
+      </w:rPr>
+    </w:lvl>
+    <w:lvl w:ilvl="7" w:tplc="08090003" w:tentative="1">
+      <w:start w:val="1"/>
+      <w:numFmt w:val="bullet"/>
+      <w:lvlText w:val="o"/>
+      <w:lvlJc w:val="left"/>
+      <w:pPr>
+        <w:ind w:left="5760" w:hanging="360"/>
+      </w:pPr>
+      <w:rPr>
+        <w:rFonts w:ascii="Courier New" w:hAnsi="Courier New" w:cs="Courier New" w:hint="default"/>
+      </w:rPr>
+    </w:lvl>
+    <w:lvl w:ilvl="8" w:tplc="08090005" w:tentative="1">
+      <w:start w:val="1"/>
+      <w:numFmt w:val="bullet"/>
+      <w:lvlText w:val=""/>
+      <w:lvlJc w:val="left"/>
+      <w:pPr>
+        <w:ind w:left="6480" w:hanging="360"/>
+      </w:pPr>
+      <w:rPr>
+        <w:rFonts w:ascii="Wingdings" w:hAnsi="Wingdings" w:hint="default"/>
+      </w:rPr>
+    </w:lvl>
+  </w:abstractNum>
+  <w:abstractNum w:abstractNumId="4" w15:restartNumberingAfterBreak="0">
     <w:nsid w:val="2A9D13E2"/>
     <w:multiLevelType w:val="hybridMultilevel"/>
     <w:tmpl w:val="C92C4B84"/>
@@ -6600,7 +7490,7 @@
       </w:pPr>
     </w:lvl>
   </w:abstractNum>
-  <w:abstractNum w:abstractNumId="3" w15:restartNumberingAfterBreak="0">
+  <w:abstractNum w:abstractNumId="5" w15:restartNumberingAfterBreak="0">
     <w:nsid w:val="348F0DE1"/>
     <w:multiLevelType w:val="hybridMultilevel"/>
     <w:tmpl w:val="1C1A79A6"/>
@@ -6689,7 +7579,7 @@
       </w:pPr>
     </w:lvl>
   </w:abstractNum>
-  <w:abstractNum w:abstractNumId="4" w15:restartNumberingAfterBreak="0">
+  <w:abstractNum w:abstractNumId="6" w15:restartNumberingAfterBreak="0">
     <w:nsid w:val="3BE03E10"/>
     <w:multiLevelType w:val="hybridMultilevel"/>
     <w:tmpl w:val="1578FF60"/>
@@ -6778,7 +7668,7 @@
       </w:pPr>
     </w:lvl>
   </w:abstractNum>
-  <w:abstractNum w:abstractNumId="5" w15:restartNumberingAfterBreak="0">
+  <w:abstractNum w:abstractNumId="7" w15:restartNumberingAfterBreak="0">
     <w:nsid w:val="3D622045"/>
     <w:multiLevelType w:val="hybridMultilevel"/>
     <w:tmpl w:val="33D4AE06"/>
@@ -6867,7 +7757,7 @@
       </w:pPr>
     </w:lvl>
   </w:abstractNum>
-  <w:abstractNum w:abstractNumId="6" w15:restartNumberingAfterBreak="0">
+  <w:abstractNum w:abstractNumId="8" w15:restartNumberingAfterBreak="0">
     <w:nsid w:val="3F3C1187"/>
     <w:multiLevelType w:val="hybridMultilevel"/>
     <w:tmpl w:val="4C9439CC"/>
@@ -6979,7 +7869,7 @@
       </w:rPr>
     </w:lvl>
   </w:abstractNum>
-  <w:abstractNum w:abstractNumId="7" w15:restartNumberingAfterBreak="0">
+  <w:abstractNum w:abstractNumId="9" w15:restartNumberingAfterBreak="0">
     <w:nsid w:val="4CF1756E"/>
     <w:multiLevelType w:val="hybridMultilevel"/>
     <w:tmpl w:val="05666E0C"/>
@@ -7068,7 +7958,7 @@
       </w:pPr>
     </w:lvl>
   </w:abstractNum>
-  <w:abstractNum w:abstractNumId="8" w15:restartNumberingAfterBreak="0">
+  <w:abstractNum w:abstractNumId="10" w15:restartNumberingAfterBreak="0">
     <w:nsid w:val="4F507BCF"/>
     <w:multiLevelType w:val="multilevel"/>
     <w:tmpl w:val="140EA35A"/>
@@ -7217,7 +8107,7 @@
       </w:rPr>
     </w:lvl>
   </w:abstractNum>
-  <w:abstractNum w:abstractNumId="9" w15:restartNumberingAfterBreak="0">
+  <w:abstractNum w:abstractNumId="11" w15:restartNumberingAfterBreak="0">
     <w:nsid w:val="506319E6"/>
     <w:multiLevelType w:val="multilevel"/>
     <w:tmpl w:val="B5AC1172"/>
@@ -7365,7 +8255,7 @@
       </w:rPr>
     </w:lvl>
   </w:abstractNum>
-  <w:abstractNum w:abstractNumId="10" w15:restartNumberingAfterBreak="0">
+  <w:abstractNum w:abstractNumId="12" w15:restartNumberingAfterBreak="0">
     <w:nsid w:val="575A6994"/>
     <w:multiLevelType w:val="hybridMultilevel"/>
     <w:tmpl w:val="83BAF5B4"/>
@@ -7454,7 +8344,7 @@
       </w:pPr>
     </w:lvl>
   </w:abstractNum>
-  <w:abstractNum w:abstractNumId="11" w15:restartNumberingAfterBreak="0">
+  <w:abstractNum w:abstractNumId="13" w15:restartNumberingAfterBreak="0">
     <w:nsid w:val="5AB0551A"/>
     <w:multiLevelType w:val="hybridMultilevel"/>
     <w:tmpl w:val="CF1A90E0"/>
@@ -7543,7 +8433,7 @@
       </w:pPr>
     </w:lvl>
   </w:abstractNum>
-  <w:abstractNum w:abstractNumId="12" w15:restartNumberingAfterBreak="0">
+  <w:abstractNum w:abstractNumId="14" w15:restartNumberingAfterBreak="0">
     <w:nsid w:val="5B5A5514"/>
     <w:multiLevelType w:val="hybridMultilevel"/>
     <w:tmpl w:val="25488A9A"/>
@@ -7632,7 +8522,7 @@
       </w:pPr>
     </w:lvl>
   </w:abstractNum>
-  <w:abstractNum w:abstractNumId="13" w15:restartNumberingAfterBreak="0">
+  <w:abstractNum w:abstractNumId="15" w15:restartNumberingAfterBreak="0">
     <w:nsid w:val="5BCA12AA"/>
     <w:multiLevelType w:val="hybridMultilevel"/>
     <w:tmpl w:val="B9D23A1E"/>
@@ -7721,7 +8611,7 @@
       </w:pPr>
     </w:lvl>
   </w:abstractNum>
-  <w:abstractNum w:abstractNumId="14" w15:restartNumberingAfterBreak="0">
+  <w:abstractNum w:abstractNumId="16" w15:restartNumberingAfterBreak="0">
     <w:nsid w:val="5BF46A39"/>
     <w:multiLevelType w:val="hybridMultilevel"/>
     <w:tmpl w:val="EBC442A0"/>
@@ -7834,7 +8724,7 @@
       </w:rPr>
     </w:lvl>
   </w:abstractNum>
-  <w:abstractNum w:abstractNumId="15" w15:restartNumberingAfterBreak="0">
+  <w:abstractNum w:abstractNumId="17" w15:restartNumberingAfterBreak="0">
     <w:nsid w:val="5F686F30"/>
     <w:multiLevelType w:val="hybridMultilevel"/>
     <w:tmpl w:val="FB6E4912"/>
@@ -7923,7 +8813,7 @@
       </w:pPr>
     </w:lvl>
   </w:abstractNum>
-  <w:abstractNum w:abstractNumId="16" w15:restartNumberingAfterBreak="0">
+  <w:abstractNum w:abstractNumId="18" w15:restartNumberingAfterBreak="0">
     <w:nsid w:val="6A6D2501"/>
     <w:multiLevelType w:val="multilevel"/>
     <w:tmpl w:val="AFE206A0"/>
@@ -8072,7 +8962,7 @@
       </w:rPr>
     </w:lvl>
   </w:abstractNum>
-  <w:abstractNum w:abstractNumId="17" w15:restartNumberingAfterBreak="0">
+  <w:abstractNum w:abstractNumId="19" w15:restartNumberingAfterBreak="0">
     <w:nsid w:val="6EA04E07"/>
     <w:multiLevelType w:val="hybridMultilevel"/>
     <w:tmpl w:val="F3C20374"/>
@@ -8161,7 +9051,7 @@
       </w:pPr>
     </w:lvl>
   </w:abstractNum>
-  <w:abstractNum w:abstractNumId="18" w15:restartNumberingAfterBreak="0">
+  <w:abstractNum w:abstractNumId="20" w15:restartNumberingAfterBreak="0">
     <w:nsid w:val="6FFB4C9A"/>
     <w:multiLevelType w:val="hybridMultilevel"/>
     <w:tmpl w:val="0CE89082"/>
@@ -8273,7 +9163,7 @@
       </w:rPr>
     </w:lvl>
   </w:abstractNum>
-  <w:abstractNum w:abstractNumId="19" w15:restartNumberingAfterBreak="0">
+  <w:abstractNum w:abstractNumId="21" w15:restartNumberingAfterBreak="0">
     <w:nsid w:val="742C0CAA"/>
     <w:multiLevelType w:val="multilevel"/>
     <w:tmpl w:val="156E96D0"/>
@@ -8422,7 +9312,7 @@
       </w:rPr>
     </w:lvl>
   </w:abstractNum>
-  <w:abstractNum w:abstractNumId="20" w15:restartNumberingAfterBreak="0">
+  <w:abstractNum w:abstractNumId="22" w15:restartNumberingAfterBreak="0">
     <w:nsid w:val="771F3D13"/>
     <w:multiLevelType w:val="hybridMultilevel"/>
     <w:tmpl w:val="44ACE2F2"/>
@@ -8534,7 +9424,7 @@
       </w:rPr>
     </w:lvl>
   </w:abstractNum>
-  <w:abstractNum w:abstractNumId="21" w15:restartNumberingAfterBreak="0">
+  <w:abstractNum w:abstractNumId="23" w15:restartNumberingAfterBreak="0">
     <w:nsid w:val="78605125"/>
     <w:multiLevelType w:val="multilevel"/>
     <w:tmpl w:val="7AE8A38C"/>
@@ -8683,7 +9573,7 @@
       </w:rPr>
     </w:lvl>
   </w:abstractNum>
-  <w:abstractNum w:abstractNumId="22" w15:restartNumberingAfterBreak="0">
+  <w:abstractNum w:abstractNumId="24" w15:restartNumberingAfterBreak="0">
     <w:nsid w:val="7D44723A"/>
     <w:multiLevelType w:val="hybridMultilevel"/>
     <w:tmpl w:val="6BC031B6"/>
@@ -8797,73 +9687,79 @@
     </w:lvl>
   </w:abstractNum>
   <w:num w:numId="1" w16cid:durableId="1044871206">
-    <w:abstractNumId w:val="12"/>
+    <w:abstractNumId w:val="14"/>
   </w:num>
   <w:num w:numId="2" w16cid:durableId="1052343797">
-    <w:abstractNumId w:val="11"/>
+    <w:abstractNumId w:val="13"/>
   </w:num>
   <w:num w:numId="3" w16cid:durableId="1218737973">
-    <w:abstractNumId w:val="7"/>
+    <w:abstractNumId w:val="9"/>
   </w:num>
   <w:num w:numId="4" w16cid:durableId="179318199">
-    <w:abstractNumId w:val="17"/>
+    <w:abstractNumId w:val="19"/>
   </w:num>
   <w:num w:numId="5" w16cid:durableId="1349063098">
     <w:abstractNumId w:val="0"/>
   </w:num>
   <w:num w:numId="6" w16cid:durableId="1638102282">
-    <w:abstractNumId w:val="13"/>
+    <w:abstractNumId w:val="15"/>
   </w:num>
   <w:num w:numId="7" w16cid:durableId="506095161">
-    <w:abstractNumId w:val="14"/>
+    <w:abstractNumId w:val="16"/>
   </w:num>
   <w:num w:numId="8" w16cid:durableId="958609661">
-    <w:abstractNumId w:val="15"/>
+    <w:abstractNumId w:val="17"/>
   </w:num>
   <w:num w:numId="9" w16cid:durableId="593364716">
+    <w:abstractNumId w:val="22"/>
+  </w:num>
+  <w:num w:numId="10" w16cid:durableId="621762484">
+    <w:abstractNumId w:val="8"/>
+  </w:num>
+  <w:num w:numId="11" w16cid:durableId="1210537537">
+    <w:abstractNumId w:val="12"/>
+  </w:num>
+  <w:num w:numId="12" w16cid:durableId="2026901125">
+    <w:abstractNumId w:val="24"/>
+  </w:num>
+  <w:num w:numId="13" w16cid:durableId="1721707459">
+    <w:abstractNumId w:val="5"/>
+  </w:num>
+  <w:num w:numId="14" w16cid:durableId="1443382819">
     <w:abstractNumId w:val="20"/>
   </w:num>
-  <w:num w:numId="10" w16cid:durableId="621762484">
+  <w:num w:numId="15" w16cid:durableId="235747520">
+    <w:abstractNumId w:val="21"/>
+  </w:num>
+  <w:num w:numId="16" w16cid:durableId="1302924117">
+    <w:abstractNumId w:val="11"/>
+  </w:num>
+  <w:num w:numId="17" w16cid:durableId="1522208512">
+    <w:abstractNumId w:val="23"/>
+  </w:num>
+  <w:num w:numId="18" w16cid:durableId="171142257">
+    <w:abstractNumId w:val="2"/>
+  </w:num>
+  <w:num w:numId="19" w16cid:durableId="841434438">
+    <w:abstractNumId w:val="18"/>
+  </w:num>
+  <w:num w:numId="20" w16cid:durableId="665287801">
+    <w:abstractNumId w:val="10"/>
+  </w:num>
+  <w:num w:numId="21" w16cid:durableId="1427186560">
+    <w:abstractNumId w:val="7"/>
+  </w:num>
+  <w:num w:numId="22" w16cid:durableId="718438217">
+    <w:abstractNumId w:val="4"/>
+  </w:num>
+  <w:num w:numId="23" w16cid:durableId="1419015562">
     <w:abstractNumId w:val="6"/>
   </w:num>
-  <w:num w:numId="11" w16cid:durableId="1210537537">
-    <w:abstractNumId w:val="10"/>
-  </w:num>
-  <w:num w:numId="12" w16cid:durableId="2026901125">
-    <w:abstractNumId w:val="22"/>
-  </w:num>
-  <w:num w:numId="13" w16cid:durableId="1721707459">
+  <w:num w:numId="24" w16cid:durableId="397900244">
     <w:abstractNumId w:val="3"/>
   </w:num>
-  <w:num w:numId="14" w16cid:durableId="1443382819">
-    <w:abstractNumId w:val="18"/>
-  </w:num>
-  <w:num w:numId="15" w16cid:durableId="235747520">
-    <w:abstractNumId w:val="19"/>
-  </w:num>
-  <w:num w:numId="16" w16cid:durableId="1302924117">
-    <w:abstractNumId w:val="9"/>
-  </w:num>
-  <w:num w:numId="17" w16cid:durableId="1522208512">
-    <w:abstractNumId w:val="21"/>
-  </w:num>
-  <w:num w:numId="18" w16cid:durableId="171142257">
+  <w:num w:numId="25" w16cid:durableId="400908358">
     <w:abstractNumId w:val="1"/>
-  </w:num>
-  <w:num w:numId="19" w16cid:durableId="841434438">
-    <w:abstractNumId w:val="16"/>
-  </w:num>
-  <w:num w:numId="20" w16cid:durableId="665287801">
-    <w:abstractNumId w:val="8"/>
-  </w:num>
-  <w:num w:numId="21" w16cid:durableId="1427186560">
-    <w:abstractNumId w:val="5"/>
-  </w:num>
-  <w:num w:numId="22" w16cid:durableId="718438217">
-    <w:abstractNumId w:val="2"/>
-  </w:num>
-  <w:num w:numId="23" w16cid:durableId="1419015562">
-    <w:abstractNumId w:val="4"/>
   </w:num>
 </w:numbering>
 </file>

</xml_diff>